<commit_message>
sửa lại báo cáo phân quyền
</commit_message>
<xml_diff>
--- a/bai_5/Báo cáo.docx
+++ b/bai_5/Báo cáo.docx
@@ -31,6 +31,7 @@
         <w:jc w:val="both"/>
         <w:rPr>
           <w:rFonts w:ascii="Times New Roman" w:hAnsi="Times New Roman" w:cs="Times New Roman"/>
+          <w:b/>
           <w:i/>
           <w:sz w:val="34"/>
           <w:szCs w:val="34"/>
@@ -39,6 +40,7 @@
       <w:r>
         <w:rPr>
           <w:rFonts w:ascii="Times New Roman" w:hAnsi="Times New Roman" w:cs="Times New Roman"/>
+          <w:b/>
           <w:i/>
           <w:sz w:val="34"/>
           <w:szCs w:val="34"/>
@@ -158,7 +160,25 @@
           <w:sz w:val="34"/>
           <w:szCs w:val="34"/>
         </w:rPr>
-        <w:t xml:space="preserve"> Many To Many</w:t>
+        <w:t xml:space="preserve"> Many </w:t>
+      </w:r>
+      <w:proofErr w:type="gramStart"/>
+      <w:r>
+        <w:rPr>
+          <w:rFonts w:ascii="Times New Roman" w:hAnsi="Times New Roman" w:cs="Times New Roman"/>
+          <w:sz w:val="34"/>
+          <w:szCs w:val="34"/>
+        </w:rPr>
+        <w:t>To</w:t>
+      </w:r>
+      <w:proofErr w:type="gramEnd"/>
+      <w:r>
+        <w:rPr>
+          <w:rFonts w:ascii="Times New Roman" w:hAnsi="Times New Roman" w:cs="Times New Roman"/>
+          <w:sz w:val="34"/>
+          <w:szCs w:val="34"/>
+        </w:rPr>
+        <w:t xml:space="preserve"> Many</w:t>
       </w:r>
       <w:r>
         <w:rPr>
@@ -187,7 +207,7 @@
           <w:szCs w:val="34"/>
         </w:rPr>
       </w:pPr>
-      <w:hyperlink r:id="rId6" w:history="1">
+      <w:hyperlink r:id="rId6" w:anchor="many-to-many-polymorphic-relations" w:history="1">
         <w:r>
           <w:rPr>
             <w:rStyle w:val="Hyperlink"/>
@@ -826,7 +846,25 @@
           <w:sz w:val="34"/>
           <w:szCs w:val="34"/>
         </w:rPr>
-        <w:t>u. Ví dụ: name=[roles[]] với thuộc tính multiple=”multiple”.</w:t>
+        <w:t>u. Ví dụ: name=[</w:t>
+      </w:r>
+      <w:proofErr w:type="gramStart"/>
+      <w:r>
+        <w:rPr>
+          <w:rFonts w:ascii="Times New Roman" w:hAnsi="Times New Roman" w:cs="Times New Roman"/>
+          <w:sz w:val="34"/>
+          <w:szCs w:val="34"/>
+        </w:rPr>
+        <w:t>roles[</w:t>
+      </w:r>
+      <w:proofErr w:type="gramEnd"/>
+      <w:r>
+        <w:rPr>
+          <w:rFonts w:ascii="Times New Roman" w:hAnsi="Times New Roman" w:cs="Times New Roman"/>
+          <w:sz w:val="34"/>
+          <w:szCs w:val="34"/>
+        </w:rPr>
+        <w:t>]] với thuộc tính multiple=”multiple”.</w:t>
       </w:r>
     </w:p>
     <w:p>
@@ -872,7 +910,7 @@
           <w:szCs w:val="34"/>
         </w:rPr>
       </w:pPr>
-      <w:hyperlink r:id="rId7" w:history="1">
+      <w:hyperlink r:id="rId7" w:anchor="database-transactions" w:history="1">
         <w:r>
           <w:rPr>
             <w:rStyle w:val="Hyperlink"/>
@@ -915,6 +953,7 @@
           <w:szCs w:val="34"/>
         </w:rPr>
       </w:pPr>
+      <w:proofErr w:type="gramStart"/>
       <w:r>
         <w:rPr>
           <w:rFonts w:ascii="Times New Roman" w:hAnsi="Times New Roman" w:cs="Times New Roman"/>
@@ -923,6 +962,7 @@
         </w:rPr>
         <w:t>try{</w:t>
       </w:r>
+      <w:proofErr w:type="gramEnd"/>
     </w:p>
     <w:p>
       <w:pPr>
@@ -947,13 +987,23 @@
           <w:szCs w:val="34"/>
         </w:rPr>
       </w:pPr>
-      <w:r>
-        <w:rPr>
-          <w:rFonts w:ascii="Times New Roman" w:hAnsi="Times New Roman" w:cs="Times New Roman"/>
-          <w:sz w:val="34"/>
-          <w:szCs w:val="34"/>
-        </w:rPr>
-        <w:t>DB::beginTransaction();</w:t>
+      <w:proofErr w:type="gramStart"/>
+      <w:r>
+        <w:rPr>
+          <w:rFonts w:ascii="Times New Roman" w:hAnsi="Times New Roman" w:cs="Times New Roman"/>
+          <w:sz w:val="34"/>
+          <w:szCs w:val="34"/>
+        </w:rPr>
+        <w:t>DB::</w:t>
+      </w:r>
+      <w:proofErr w:type="gramEnd"/>
+      <w:r>
+        <w:rPr>
+          <w:rFonts w:ascii="Times New Roman" w:hAnsi="Times New Roman" w:cs="Times New Roman"/>
+          <w:sz w:val="34"/>
+          <w:szCs w:val="34"/>
+        </w:rPr>
+        <w:t>beginTransaction();</w:t>
       </w:r>
     </w:p>
     <w:p>
@@ -979,13 +1029,23 @@
           <w:szCs w:val="34"/>
         </w:rPr>
       </w:pPr>
-      <w:r>
-        <w:rPr>
-          <w:rFonts w:ascii="Times New Roman" w:hAnsi="Times New Roman" w:cs="Times New Roman"/>
-          <w:sz w:val="34"/>
-          <w:szCs w:val="34"/>
-        </w:rPr>
-        <w:t>….xử lý thêm dữ liệu;</w:t>
+      <w:proofErr w:type="gramStart"/>
+      <w:r>
+        <w:rPr>
+          <w:rFonts w:ascii="Times New Roman" w:hAnsi="Times New Roman" w:cs="Times New Roman"/>
+          <w:sz w:val="34"/>
+          <w:szCs w:val="34"/>
+        </w:rPr>
+        <w:t>….xử</w:t>
+      </w:r>
+      <w:proofErr w:type="gramEnd"/>
+      <w:r>
+        <w:rPr>
+          <w:rFonts w:ascii="Times New Roman" w:hAnsi="Times New Roman" w:cs="Times New Roman"/>
+          <w:sz w:val="34"/>
+          <w:szCs w:val="34"/>
+        </w:rPr>
+        <w:t xml:space="preserve"> lý thêm dữ liệu;</w:t>
       </w:r>
     </w:p>
     <w:p>
@@ -1059,13 +1119,23 @@
           <w:szCs w:val="34"/>
         </w:rPr>
       </w:pPr>
-      <w:r>
-        <w:rPr>
-          <w:rFonts w:ascii="Times New Roman" w:hAnsi="Times New Roman" w:cs="Times New Roman"/>
-          <w:sz w:val="34"/>
-          <w:szCs w:val="34"/>
-        </w:rPr>
-        <w:t>DB::commit();</w:t>
+      <w:proofErr w:type="gramStart"/>
+      <w:r>
+        <w:rPr>
+          <w:rFonts w:ascii="Times New Roman" w:hAnsi="Times New Roman" w:cs="Times New Roman"/>
+          <w:sz w:val="34"/>
+          <w:szCs w:val="34"/>
+        </w:rPr>
+        <w:t>DB::</w:t>
+      </w:r>
+      <w:proofErr w:type="gramEnd"/>
+      <w:r>
+        <w:rPr>
+          <w:rFonts w:ascii="Times New Roman" w:hAnsi="Times New Roman" w:cs="Times New Roman"/>
+          <w:sz w:val="34"/>
+          <w:szCs w:val="34"/>
+        </w:rPr>
+        <w:t>commit();</w:t>
       </w:r>
     </w:p>
     <w:p>
@@ -1091,13 +1161,23 @@
           <w:szCs w:val="34"/>
         </w:rPr>
       </w:pPr>
-      <w:r>
-        <w:rPr>
-          <w:rFonts w:ascii="Times New Roman" w:hAnsi="Times New Roman" w:cs="Times New Roman"/>
-          <w:sz w:val="34"/>
-          <w:szCs w:val="34"/>
-        </w:rPr>
-        <w:t>}catch(err)</w:t>
+      <w:proofErr w:type="gramStart"/>
+      <w:r>
+        <w:rPr>
+          <w:rFonts w:ascii="Times New Roman" w:hAnsi="Times New Roman" w:cs="Times New Roman"/>
+          <w:sz w:val="34"/>
+          <w:szCs w:val="34"/>
+        </w:rPr>
+        <w:t>}catch</w:t>
+      </w:r>
+      <w:proofErr w:type="gramEnd"/>
+      <w:r>
+        <w:rPr>
+          <w:rFonts w:ascii="Times New Roman" w:hAnsi="Times New Roman" w:cs="Times New Roman"/>
+          <w:sz w:val="34"/>
+          <w:szCs w:val="34"/>
+        </w:rPr>
+        <w:t>(err)</w:t>
       </w:r>
     </w:p>
     <w:p>
@@ -1143,13 +1223,23 @@
           <w:szCs w:val="34"/>
         </w:rPr>
       </w:pPr>
-      <w:r>
-        <w:rPr>
-          <w:rFonts w:ascii="Times New Roman" w:hAnsi="Times New Roman" w:cs="Times New Roman"/>
-          <w:sz w:val="34"/>
-          <w:szCs w:val="34"/>
-        </w:rPr>
-        <w:t>DB::rollBack();</w:t>
+      <w:proofErr w:type="gramStart"/>
+      <w:r>
+        <w:rPr>
+          <w:rFonts w:ascii="Times New Roman" w:hAnsi="Times New Roman" w:cs="Times New Roman"/>
+          <w:sz w:val="34"/>
+          <w:szCs w:val="34"/>
+        </w:rPr>
+        <w:t>DB::</w:t>
+      </w:r>
+      <w:proofErr w:type="gramEnd"/>
+      <w:r>
+        <w:rPr>
+          <w:rFonts w:ascii="Times New Roman" w:hAnsi="Times New Roman" w:cs="Times New Roman"/>
+          <w:sz w:val="34"/>
+          <w:szCs w:val="34"/>
+        </w:rPr>
+        <w:t>rollBack();</w:t>
       </w:r>
     </w:p>
     <w:p>
@@ -1296,7 +1386,7 @@
           <w:szCs w:val="34"/>
         </w:rPr>
       </w:pPr>
-      <w:hyperlink r:id="rId8" w:history="1">
+      <w:hyperlink r:id="rId8" w:anchor="method-pluck" w:history="1">
         <w:r>
           <w:rPr>
             <w:rStyle w:val="Hyperlink"/>
@@ -1345,7 +1435,25 @@
           <w:sz w:val="34"/>
           <w:szCs w:val="34"/>
         </w:rPr>
-        <w:t>$user = DB::table(‘role_user’)-&gt;</w:t>
+        <w:t xml:space="preserve">$user = </w:t>
+      </w:r>
+      <w:proofErr w:type="gramStart"/>
+      <w:r>
+        <w:rPr>
+          <w:rFonts w:ascii="Times New Roman" w:hAnsi="Times New Roman" w:cs="Times New Roman"/>
+          <w:sz w:val="34"/>
+          <w:szCs w:val="34"/>
+        </w:rPr>
+        <w:t>DB::</w:t>
+      </w:r>
+      <w:proofErr w:type="gramEnd"/>
+      <w:r>
+        <w:rPr>
+          <w:rFonts w:ascii="Times New Roman" w:hAnsi="Times New Roman" w:cs="Times New Roman"/>
+          <w:sz w:val="34"/>
+          <w:szCs w:val="34"/>
+        </w:rPr>
+        <w:t>table(‘role_user’)-&gt;</w:t>
       </w:r>
       <w:r>
         <w:rPr>
@@ -1407,7 +1515,7 @@
           <w:szCs w:val="34"/>
         </w:rPr>
       </w:pPr>
-      <w:hyperlink r:id="rId9" w:history="1">
+      <w:hyperlink r:id="rId9" w:anchor="method-contains" w:history="1">
         <w:r>
           <w:rPr>
             <w:rStyle w:val="Hyperlink"/>
@@ -1543,7 +1651,25 @@
           <w:sz w:val="34"/>
           <w:szCs w:val="34"/>
         </w:rPr>
-        <w:t>Ghép các bảng dữ liệu(user,role_user, roles), chọn ra tất cả các thuộc tính select(‘roles.*’)</w:t>
+        <w:t xml:space="preserve">Ghép các bảng dữ </w:t>
+      </w:r>
+      <w:proofErr w:type="gramStart"/>
+      <w:r>
+        <w:rPr>
+          <w:rFonts w:ascii="Times New Roman" w:hAnsi="Times New Roman" w:cs="Times New Roman"/>
+          <w:sz w:val="34"/>
+          <w:szCs w:val="34"/>
+        </w:rPr>
+        <w:t>liệu(</w:t>
+      </w:r>
+      <w:proofErr w:type="gramEnd"/>
+      <w:r>
+        <w:rPr>
+          <w:rFonts w:ascii="Times New Roman" w:hAnsi="Times New Roman" w:cs="Times New Roman"/>
+          <w:sz w:val="34"/>
+          <w:szCs w:val="34"/>
+        </w:rPr>
+        <w:t>user,role_user, roles), chọn ra tất cả các thuộc tính select(‘roles.*’)</w:t>
       </w:r>
       <w:r>
         <w:rPr>
@@ -1565,7 +1691,7 @@
           <w:szCs w:val="34"/>
         </w:rPr>
       </w:pPr>
-      <w:hyperlink r:id="rId10" w:history="1">
+      <w:hyperlink r:id="rId10" w:anchor="joins" w:history="1">
         <w:r>
           <w:rPr>
             <w:rStyle w:val="Hyperlink"/>
@@ -1597,7 +1723,25 @@
           <w:sz w:val="34"/>
           <w:szCs w:val="34"/>
         </w:rPr>
-        <w:t>Sau đó pluck(id) mảng dữ liệu đó, sử dụng hàm toArray();</w:t>
+        <w:t xml:space="preserve">Sau đó pluck(id) mảng dữ liệu đó, sử dụng hàm </w:t>
+      </w:r>
+      <w:proofErr w:type="gramStart"/>
+      <w:r>
+        <w:rPr>
+          <w:rFonts w:ascii="Times New Roman" w:hAnsi="Times New Roman" w:cs="Times New Roman"/>
+          <w:sz w:val="34"/>
+          <w:szCs w:val="34"/>
+        </w:rPr>
+        <w:t>toArray(</w:t>
+      </w:r>
+      <w:proofErr w:type="gramEnd"/>
+      <w:r>
+        <w:rPr>
+          <w:rFonts w:ascii="Times New Roman" w:hAnsi="Times New Roman" w:cs="Times New Roman"/>
+          <w:sz w:val="34"/>
+          <w:szCs w:val="34"/>
+        </w:rPr>
+        <w:t>);</w:t>
       </w:r>
     </w:p>
     <w:p>
@@ -1617,7 +1761,25 @@
           <w:sz w:val="34"/>
           <w:szCs w:val="34"/>
         </w:rPr>
-        <w:t>“$list=DB::table(‘users’)</w:t>
+        <w:t>“$list=</w:t>
+      </w:r>
+      <w:proofErr w:type="gramStart"/>
+      <w:r>
+        <w:rPr>
+          <w:rFonts w:ascii="Times New Roman" w:hAnsi="Times New Roman" w:cs="Times New Roman"/>
+          <w:sz w:val="34"/>
+          <w:szCs w:val="34"/>
+        </w:rPr>
+        <w:t>DB::</w:t>
+      </w:r>
+      <w:proofErr w:type="gramEnd"/>
+      <w:r>
+        <w:rPr>
+          <w:rFonts w:ascii="Times New Roman" w:hAnsi="Times New Roman" w:cs="Times New Roman"/>
+          <w:sz w:val="34"/>
+          <w:szCs w:val="34"/>
+        </w:rPr>
+        <w:t>table(‘users’)</w:t>
       </w:r>
     </w:p>
     <w:p>
@@ -1657,7 +1819,25 @@
           <w:sz w:val="34"/>
           <w:szCs w:val="34"/>
         </w:rPr>
-        <w:t>-&gt;join(‘roles’,’role_user.role_id’,’=’,’roles.id’)</w:t>
+        <w:t>-&gt;join(‘roles’,’role_</w:t>
+      </w:r>
+      <w:proofErr w:type="gramStart"/>
+      <w:r>
+        <w:rPr>
+          <w:rFonts w:ascii="Times New Roman" w:hAnsi="Times New Roman" w:cs="Times New Roman"/>
+          <w:sz w:val="34"/>
+          <w:szCs w:val="34"/>
+        </w:rPr>
+        <w:t>user.role</w:t>
+      </w:r>
+      <w:proofErr w:type="gramEnd"/>
+      <w:r>
+        <w:rPr>
+          <w:rFonts w:ascii="Times New Roman" w:hAnsi="Times New Roman" w:cs="Times New Roman"/>
+          <w:sz w:val="34"/>
+          <w:szCs w:val="34"/>
+        </w:rPr>
+        <w:t>_id’,’=’,’roles.id’)</w:t>
       </w:r>
     </w:p>
     <w:p>
@@ -1677,7 +1857,25 @@
           <w:sz w:val="34"/>
           <w:szCs w:val="34"/>
         </w:rPr>
-        <w:t>-&gt;where(‘users.id’,auth()-&gt;id())</w:t>
+        <w:t>-&gt;where(‘users.id</w:t>
+      </w:r>
+      <w:proofErr w:type="gramStart"/>
+      <w:r>
+        <w:rPr>
+          <w:rFonts w:ascii="Times New Roman" w:hAnsi="Times New Roman" w:cs="Times New Roman"/>
+          <w:sz w:val="34"/>
+          <w:szCs w:val="34"/>
+        </w:rPr>
+        <w:t>’,auth</w:t>
+      </w:r>
+      <w:proofErr w:type="gramEnd"/>
+      <w:r>
+        <w:rPr>
+          <w:rFonts w:ascii="Times New Roman" w:hAnsi="Times New Roman" w:cs="Times New Roman"/>
+          <w:sz w:val="34"/>
+          <w:szCs w:val="34"/>
+        </w:rPr>
+        <w:t>()-&gt;id())</w:t>
       </w:r>
     </w:p>
     <w:p>
@@ -1697,7 +1895,25 @@
           <w:sz w:val="34"/>
           <w:szCs w:val="34"/>
         </w:rPr>
-        <w:t>-&gt;select(‘roles.*’)</w:t>
+        <w:t>-&gt;select(‘</w:t>
+      </w:r>
+      <w:proofErr w:type="gramStart"/>
+      <w:r>
+        <w:rPr>
+          <w:rFonts w:ascii="Times New Roman" w:hAnsi="Times New Roman" w:cs="Times New Roman"/>
+          <w:sz w:val="34"/>
+          <w:szCs w:val="34"/>
+        </w:rPr>
+        <w:t>roles.*</w:t>
+      </w:r>
+      <w:proofErr w:type="gramEnd"/>
+      <w:r>
+        <w:rPr>
+          <w:rFonts w:ascii="Times New Roman" w:hAnsi="Times New Roman" w:cs="Times New Roman"/>
+          <w:sz w:val="34"/>
+          <w:szCs w:val="34"/>
+        </w:rPr>
+        <w:t>’)</w:t>
       </w:r>
     </w:p>
     <w:p>
@@ -1717,7 +1933,25 @@
           <w:sz w:val="34"/>
           <w:szCs w:val="34"/>
         </w:rPr>
-        <w:t>-&gt;get()-&gt;pluck(‘id’)-&gt;toArray();</w:t>
+        <w:t>-&gt;get()-&gt;pluck(‘id’)-&gt;</w:t>
+      </w:r>
+      <w:proofErr w:type="gramStart"/>
+      <w:r>
+        <w:rPr>
+          <w:rFonts w:ascii="Times New Roman" w:hAnsi="Times New Roman" w:cs="Times New Roman"/>
+          <w:sz w:val="34"/>
+          <w:szCs w:val="34"/>
+        </w:rPr>
+        <w:t>toArray(</w:t>
+      </w:r>
+      <w:proofErr w:type="gramEnd"/>
+      <w:r>
+        <w:rPr>
+          <w:rFonts w:ascii="Times New Roman" w:hAnsi="Times New Roman" w:cs="Times New Roman"/>
+          <w:sz w:val="34"/>
+          <w:szCs w:val="34"/>
+        </w:rPr>
+        <w:t>);</w:t>
       </w:r>
     </w:p>
     <w:p>
@@ -1738,6 +1972,2134 @@
           <w:szCs w:val="34"/>
         </w:rPr>
         <w:t xml:space="preserve">”  </w:t>
+      </w:r>
+    </w:p>
+    <w:p>
+      <w:pPr>
+        <w:jc w:val="both"/>
+        <w:rPr>
+          <w:rFonts w:ascii="Times New Roman" w:hAnsi="Times New Roman" w:cs="Times New Roman"/>
+          <w:b/>
+          <w:i/>
+          <w:sz w:val="34"/>
+          <w:szCs w:val="34"/>
+        </w:rPr>
+      </w:pPr>
+      <w:r>
+        <w:rPr>
+          <w:rFonts w:ascii="Times New Roman" w:hAnsi="Times New Roman" w:cs="Times New Roman"/>
+          <w:b/>
+          <w:i/>
+          <w:sz w:val="34"/>
+          <w:szCs w:val="34"/>
+        </w:rPr>
+        <w:t>Mô hình áp dụng:</w:t>
+      </w:r>
+    </w:p>
+    <w:p>
+      <w:pPr>
+        <w:jc w:val="both"/>
+        <w:rPr>
+          <w:rFonts w:ascii="Times New Roman" w:hAnsi="Times New Roman" w:cs="Times New Roman"/>
+          <w:i/>
+          <w:sz w:val="34"/>
+          <w:szCs w:val="34"/>
+        </w:rPr>
+      </w:pPr>
+      <w:r>
+        <w:rPr>
+          <w:noProof/>
+        </w:rPr>
+        <w:drawing>
+          <wp:inline distT="0" distB="0" distL="0" distR="0">
+            <wp:extent cx="5029200" cy="1708150"/>
+            <wp:effectExtent l="0" t="0" r="0" b="6350"/>
+            <wp:docPr id="3" name="Picture 3" descr="https://documents.lucid.app/documents/8ce2dfd5-2e49-438f-9d3d-24d837b0de8e/pages/iV_38ZpwwffT?a=756&amp;x=98&amp;y=109&amp;w=704&amp;h=238&amp;store=1&amp;accept=image%2F*&amp;auth=LCA%2032a0733f1503509fec82ab99565eadef8922e2a2-ts%3D1647917052"/>
+            <wp:cNvGraphicFramePr>
+              <a:graphicFrameLocks xmlns:a="http://schemas.openxmlformats.org/drawingml/2006/main" noChangeAspect="1"/>
+            </wp:cNvGraphicFramePr>
+            <a:graphic xmlns:a="http://schemas.openxmlformats.org/drawingml/2006/main">
+              <a:graphicData uri="http://schemas.openxmlformats.org/drawingml/2006/picture">
+                <pic:pic xmlns:pic="http://schemas.openxmlformats.org/drawingml/2006/picture">
+                  <pic:nvPicPr>
+                    <pic:cNvPr id="0" name="Picture 1" descr="https://documents.lucid.app/documents/8ce2dfd5-2e49-438f-9d3d-24d837b0de8e/pages/iV_38ZpwwffT?a=756&amp;x=98&amp;y=109&amp;w=704&amp;h=238&amp;store=1&amp;accept=image%2F*&amp;auth=LCA%2032a0733f1503509fec82ab99565eadef8922e2a2-ts%3D1647917052"/>
+                    <pic:cNvPicPr>
+                      <a:picLocks noChangeAspect="1" noChangeArrowheads="1"/>
+                    </pic:cNvPicPr>
+                  </pic:nvPicPr>
+                  <pic:blipFill>
+                    <a:blip r:embed="rId11">
+                      <a:extLst>
+                        <a:ext uri="{28A0092B-C50C-407E-A947-70E740481C1C}">
+                          <a14:useLocalDpi xmlns:a14="http://schemas.microsoft.com/office/drawing/2010/main" val="0"/>
+                        </a:ext>
+                      </a:extLst>
+                    </a:blip>
+                    <a:srcRect/>
+                    <a:stretch>
+                      <a:fillRect/>
+                    </a:stretch>
+                  </pic:blipFill>
+                  <pic:spPr bwMode="auto">
+                    <a:xfrm>
+                      <a:off x="0" y="0"/>
+                      <a:ext cx="5029200" cy="1708150"/>
+                    </a:xfrm>
+                    <a:prstGeom prst="rect">
+                      <a:avLst/>
+                    </a:prstGeom>
+                    <a:noFill/>
+                    <a:ln>
+                      <a:noFill/>
+                    </a:ln>
+                  </pic:spPr>
+                </pic:pic>
+              </a:graphicData>
+            </a:graphic>
+          </wp:inline>
+        </w:drawing>
+      </w:r>
+    </w:p>
+    <w:p>
+      <w:pPr>
+        <w:jc w:val="both"/>
+        <w:rPr>
+          <w:rFonts w:ascii="Times New Roman" w:hAnsi="Times New Roman" w:cs="Times New Roman"/>
+          <w:i/>
+          <w:sz w:val="34"/>
+          <w:szCs w:val="34"/>
+        </w:rPr>
+      </w:pPr>
+      <w:r>
+        <w:rPr>
+          <w:rFonts w:ascii="Times New Roman" w:hAnsi="Times New Roman" w:cs="Times New Roman"/>
+          <w:i/>
+          <w:sz w:val="34"/>
+          <w:szCs w:val="34"/>
+        </w:rPr>
+        <w:t>Hướng dẫn cài đặt</w:t>
+      </w:r>
+      <w:r>
+        <w:rPr>
+          <w:rFonts w:ascii="Times New Roman" w:hAnsi="Times New Roman" w:cs="Times New Roman"/>
+          <w:i/>
+          <w:sz w:val="34"/>
+          <w:szCs w:val="34"/>
+        </w:rPr>
+        <w:t>:</w:t>
+      </w:r>
+    </w:p>
+    <w:p>
+      <w:pPr>
+        <w:pStyle w:val="ListParagraph"/>
+        <w:numPr>
+          <w:ilvl w:val="0"/>
+          <w:numId w:val="4"/>
+        </w:numPr>
+        <w:jc w:val="both"/>
+        <w:rPr>
+          <w:rFonts w:ascii="Times New Roman" w:hAnsi="Times New Roman" w:cs="Times New Roman"/>
+          <w:sz w:val="34"/>
+          <w:szCs w:val="34"/>
+        </w:rPr>
+      </w:pPr>
+      <w:r>
+        <w:rPr>
+          <w:rFonts w:ascii="Times New Roman" w:hAnsi="Times New Roman" w:cs="Times New Roman"/>
+          <w:sz w:val="34"/>
+          <w:szCs w:val="34"/>
+        </w:rPr>
+        <w:lastRenderedPageBreak/>
+        <w:t>Tạo ra các bảng dữ liệu cần thiết, bao gồm bảng dữ liệu user và bảng dữ liệu roles.</w:t>
+      </w:r>
+    </w:p>
+    <w:p>
+      <w:pPr>
+        <w:pStyle w:val="ListParagraph"/>
+        <w:numPr>
+          <w:ilvl w:val="0"/>
+          <w:numId w:val="4"/>
+        </w:numPr>
+        <w:jc w:val="both"/>
+        <w:rPr>
+          <w:rFonts w:ascii="Times New Roman" w:hAnsi="Times New Roman" w:cs="Times New Roman"/>
+          <w:sz w:val="34"/>
+          <w:szCs w:val="34"/>
+        </w:rPr>
+      </w:pPr>
+      <w:r>
+        <w:rPr>
+          <w:rFonts w:ascii="Times New Roman" w:hAnsi="Times New Roman" w:cs="Times New Roman"/>
+          <w:sz w:val="34"/>
+          <w:szCs w:val="34"/>
+        </w:rPr>
+        <w:t>Tạo sedder dữ liệu cho 2 bảng trên.</w:t>
+      </w:r>
+    </w:p>
+    <w:p>
+      <w:pPr>
+        <w:pStyle w:val="ListParagraph"/>
+        <w:numPr>
+          <w:ilvl w:val="0"/>
+          <w:numId w:val="4"/>
+        </w:numPr>
+        <w:jc w:val="both"/>
+        <w:rPr>
+          <w:rFonts w:ascii="Times New Roman" w:hAnsi="Times New Roman" w:cs="Times New Roman"/>
+          <w:sz w:val="34"/>
+          <w:szCs w:val="34"/>
+        </w:rPr>
+      </w:pPr>
+      <w:r>
+        <w:rPr>
+          <w:rFonts w:ascii="Times New Roman" w:hAnsi="Times New Roman" w:cs="Times New Roman"/>
+          <w:sz w:val="34"/>
+          <w:szCs w:val="34"/>
+        </w:rPr>
+        <w:t>Sau đó chúng ta sẽ check phân quyền cho user.</w:t>
+      </w:r>
+    </w:p>
+    <w:p>
+      <w:pPr>
+        <w:pStyle w:val="ListParagraph"/>
+        <w:numPr>
+          <w:ilvl w:val="1"/>
+          <w:numId w:val="4"/>
+        </w:numPr>
+        <w:jc w:val="both"/>
+        <w:rPr>
+          <w:rFonts w:ascii="Times New Roman" w:hAnsi="Times New Roman" w:cs="Times New Roman"/>
+          <w:sz w:val="34"/>
+          <w:szCs w:val="34"/>
+        </w:rPr>
+      </w:pPr>
+      <w:r>
+        <w:rPr>
+          <w:rFonts w:ascii="Times New Roman" w:hAnsi="Times New Roman" w:cs="Times New Roman"/>
+          <w:sz w:val="34"/>
+          <w:szCs w:val="34"/>
+        </w:rPr>
+        <w:t xml:space="preserve">Đầu tiên chúng ta sẽ tạo một </w:t>
+      </w:r>
+      <w:r>
+        <w:rPr>
+          <w:rFonts w:ascii="Times New Roman" w:hAnsi="Times New Roman" w:cs="Times New Roman"/>
+          <w:sz w:val="34"/>
+          <w:szCs w:val="34"/>
+        </w:rPr>
+        <w:t>middleware</w:t>
+      </w:r>
+      <w:r>
+        <w:rPr>
+          <w:rFonts w:ascii="Times New Roman" w:hAnsi="Times New Roman" w:cs="Times New Roman"/>
+          <w:sz w:val="34"/>
+          <w:szCs w:val="34"/>
+        </w:rPr>
+        <w:t xml:space="preserve"> đặt tên checkPermission và gọi lại hàm này trong thư mục Kernel.php</w:t>
+      </w:r>
+    </w:p>
+    <w:p>
+      <w:pPr>
+        <w:pStyle w:val="ListParagraph"/>
+        <w:numPr>
+          <w:ilvl w:val="1"/>
+          <w:numId w:val="4"/>
+        </w:numPr>
+        <w:jc w:val="both"/>
+        <w:rPr>
+          <w:rFonts w:ascii="Times New Roman" w:hAnsi="Times New Roman" w:cs="Times New Roman"/>
+          <w:sz w:val="34"/>
+          <w:szCs w:val="34"/>
+        </w:rPr>
+      </w:pPr>
+      <w:r>
+        <w:rPr>
+          <w:rFonts w:ascii="Times New Roman" w:hAnsi="Times New Roman" w:cs="Times New Roman"/>
+          <w:sz w:val="34"/>
+          <w:szCs w:val="34"/>
+        </w:rPr>
+        <w:t xml:space="preserve">Trong thư mục checkPermission chúng ta viết 1 </w:t>
+      </w:r>
+      <w:r>
+        <w:rPr>
+          <w:rFonts w:ascii="Times New Roman" w:hAnsi="Times New Roman" w:cs="Times New Roman"/>
+          <w:sz w:val="34"/>
+          <w:szCs w:val="34"/>
+        </w:rPr>
+        <w:t>đoạn query</w:t>
+      </w:r>
+      <w:r>
+        <w:rPr>
+          <w:rFonts w:ascii="Times New Roman" w:hAnsi="Times New Roman" w:cs="Times New Roman"/>
+          <w:sz w:val="34"/>
+          <w:szCs w:val="34"/>
+        </w:rPr>
+        <w:t xml:space="preserve"> lấy nhữ</w:t>
+      </w:r>
+      <w:r>
+        <w:rPr>
+          <w:rFonts w:ascii="Times New Roman" w:hAnsi="Times New Roman" w:cs="Times New Roman"/>
+          <w:sz w:val="34"/>
+          <w:szCs w:val="34"/>
+        </w:rPr>
+        <w:t>ng lấy những quyền theo tài khoản đăng nhập. Sử dụng pluck chỉ lấy riêng thuộc tính roles_module</w:t>
+      </w:r>
+    </w:p>
+    <w:p>
+      <w:pPr>
+        <w:pStyle w:val="ListParagraph"/>
+        <w:numPr>
+          <w:ilvl w:val="2"/>
+          <w:numId w:val="4"/>
+        </w:numPr>
+        <w:shd w:val="clear" w:color="auto" w:fill="1E1E1E"/>
+        <w:spacing w:after="0" w:line="285" w:lineRule="atLeast"/>
+        <w:rPr>
+          <w:rFonts w:ascii="Consolas" w:eastAsia="Times New Roman" w:hAnsi="Consolas" w:cs="Times New Roman"/>
+          <w:color w:val="D4D4D4"/>
+          <w:sz w:val="21"/>
+          <w:szCs w:val="21"/>
+        </w:rPr>
+      </w:pPr>
+      <w:r>
+        <w:rPr>
+          <w:rFonts w:ascii="Consolas" w:eastAsia="Times New Roman" w:hAnsi="Consolas" w:cs="Times New Roman"/>
+          <w:color w:val="9CDCFE"/>
+          <w:sz w:val="21"/>
+          <w:szCs w:val="21"/>
+        </w:rPr>
+        <w:t>$checkArray</w:t>
+      </w:r>
+      <w:r>
+        <w:rPr>
+          <w:rFonts w:ascii="Consolas" w:eastAsia="Times New Roman" w:hAnsi="Consolas" w:cs="Times New Roman"/>
+          <w:color w:val="D4D4D4"/>
+          <w:sz w:val="21"/>
+          <w:szCs w:val="21"/>
+        </w:rPr>
+        <w:t>=</w:t>
+      </w:r>
+      <w:proofErr w:type="gramStart"/>
+      <w:r>
+        <w:rPr>
+          <w:rFonts w:ascii="Consolas" w:eastAsia="Times New Roman" w:hAnsi="Consolas" w:cs="Times New Roman"/>
+          <w:color w:val="4EC9B0"/>
+          <w:sz w:val="21"/>
+          <w:szCs w:val="21"/>
+        </w:rPr>
+        <w:t>Role</w:t>
+      </w:r>
+      <w:r>
+        <w:rPr>
+          <w:rFonts w:ascii="Consolas" w:eastAsia="Times New Roman" w:hAnsi="Consolas" w:cs="Times New Roman"/>
+          <w:color w:val="D4D4D4"/>
+          <w:sz w:val="21"/>
+          <w:szCs w:val="21"/>
+        </w:rPr>
+        <w:t>::</w:t>
+      </w:r>
+      <w:proofErr w:type="gramEnd"/>
+      <w:r>
+        <w:rPr>
+          <w:rFonts w:ascii="Consolas" w:eastAsia="Times New Roman" w:hAnsi="Consolas" w:cs="Times New Roman"/>
+          <w:color w:val="DCDCAA"/>
+          <w:sz w:val="21"/>
+          <w:szCs w:val="21"/>
+        </w:rPr>
+        <w:t>where</w:t>
+      </w:r>
+      <w:r>
+        <w:rPr>
+          <w:rFonts w:ascii="Consolas" w:eastAsia="Times New Roman" w:hAnsi="Consolas" w:cs="Times New Roman"/>
+          <w:color w:val="D4D4D4"/>
+          <w:sz w:val="21"/>
+          <w:szCs w:val="21"/>
+        </w:rPr>
+        <w:t>(</w:t>
+      </w:r>
+      <w:r>
+        <w:rPr>
+          <w:rFonts w:ascii="Consolas" w:eastAsia="Times New Roman" w:hAnsi="Consolas" w:cs="Times New Roman"/>
+          <w:color w:val="CE9178"/>
+          <w:sz w:val="21"/>
+          <w:szCs w:val="21"/>
+        </w:rPr>
+        <w:t>'id'</w:t>
+      </w:r>
+      <w:r>
+        <w:rPr>
+          <w:rFonts w:ascii="Consolas" w:eastAsia="Times New Roman" w:hAnsi="Consolas" w:cs="Times New Roman"/>
+          <w:color w:val="D4D4D4"/>
+          <w:sz w:val="21"/>
+          <w:szCs w:val="21"/>
+        </w:rPr>
+        <w:t>,</w:t>
+      </w:r>
+      <w:r>
+        <w:rPr>
+          <w:rFonts w:ascii="Consolas" w:eastAsia="Times New Roman" w:hAnsi="Consolas" w:cs="Times New Roman"/>
+          <w:color w:val="CE9178"/>
+          <w:sz w:val="21"/>
+          <w:szCs w:val="21"/>
+        </w:rPr>
+        <w:t>'='</w:t>
+      </w:r>
+      <w:r>
+        <w:rPr>
+          <w:rFonts w:ascii="Consolas" w:eastAsia="Times New Roman" w:hAnsi="Consolas" w:cs="Times New Roman"/>
+          <w:color w:val="D4D4D4"/>
+          <w:sz w:val="21"/>
+          <w:szCs w:val="21"/>
+        </w:rPr>
+        <w:t>,(</w:t>
+      </w:r>
+      <w:r>
+        <w:rPr>
+          <w:rFonts w:ascii="Consolas" w:eastAsia="Times New Roman" w:hAnsi="Consolas" w:cs="Times New Roman"/>
+          <w:color w:val="569CD6"/>
+          <w:sz w:val="21"/>
+          <w:szCs w:val="21"/>
+        </w:rPr>
+        <w:t>int</w:t>
+      </w:r>
+      <w:r>
+        <w:rPr>
+          <w:rFonts w:ascii="Consolas" w:eastAsia="Times New Roman" w:hAnsi="Consolas" w:cs="Times New Roman"/>
+          <w:color w:val="D4D4D4"/>
+          <w:sz w:val="21"/>
+          <w:szCs w:val="21"/>
+        </w:rPr>
+        <w:t>)</w:t>
+      </w:r>
+      <w:r>
+        <w:rPr>
+          <w:rFonts w:ascii="Consolas" w:eastAsia="Times New Roman" w:hAnsi="Consolas" w:cs="Times New Roman"/>
+          <w:color w:val="4EC9B0"/>
+          <w:sz w:val="21"/>
+          <w:szCs w:val="21"/>
+        </w:rPr>
+        <w:t>Auth</w:t>
+      </w:r>
+      <w:r>
+        <w:rPr>
+          <w:rFonts w:ascii="Consolas" w:eastAsia="Times New Roman" w:hAnsi="Consolas" w:cs="Times New Roman"/>
+          <w:color w:val="D4D4D4"/>
+          <w:sz w:val="21"/>
+          <w:szCs w:val="21"/>
+        </w:rPr>
+        <w:t>::</w:t>
+      </w:r>
+      <w:r>
+        <w:rPr>
+          <w:rFonts w:ascii="Consolas" w:eastAsia="Times New Roman" w:hAnsi="Consolas" w:cs="Times New Roman"/>
+          <w:color w:val="DCDCAA"/>
+          <w:sz w:val="21"/>
+          <w:szCs w:val="21"/>
+        </w:rPr>
+        <w:t>user</w:t>
+      </w:r>
+      <w:r>
+        <w:rPr>
+          <w:rFonts w:ascii="Consolas" w:eastAsia="Times New Roman" w:hAnsi="Consolas" w:cs="Times New Roman"/>
+          <w:color w:val="D4D4D4"/>
+          <w:sz w:val="21"/>
+          <w:szCs w:val="21"/>
+        </w:rPr>
+        <w:t>()-&gt;</w:t>
+      </w:r>
+      <w:r>
+        <w:rPr>
+          <w:rFonts w:ascii="Consolas" w:eastAsia="Times New Roman" w:hAnsi="Consolas" w:cs="Times New Roman"/>
+          <w:color w:val="9CDCFE"/>
+          <w:sz w:val="21"/>
+          <w:szCs w:val="21"/>
+        </w:rPr>
+        <w:t>permission_id</w:t>
+      </w:r>
+      <w:r>
+        <w:rPr>
+          <w:rFonts w:ascii="Consolas" w:eastAsia="Times New Roman" w:hAnsi="Consolas" w:cs="Times New Roman"/>
+          <w:color w:val="D4D4D4"/>
+          <w:sz w:val="21"/>
+          <w:szCs w:val="21"/>
+        </w:rPr>
+        <w:t>)-&gt;</w:t>
+      </w:r>
+      <w:r>
+        <w:rPr>
+          <w:rFonts w:ascii="Consolas" w:eastAsia="Times New Roman" w:hAnsi="Consolas" w:cs="Times New Roman"/>
+          <w:color w:val="DCDCAA"/>
+          <w:sz w:val="21"/>
+          <w:szCs w:val="21"/>
+        </w:rPr>
+        <w:t>pluck</w:t>
+      </w:r>
+      <w:r>
+        <w:rPr>
+          <w:rFonts w:ascii="Consolas" w:eastAsia="Times New Roman" w:hAnsi="Consolas" w:cs="Times New Roman"/>
+          <w:color w:val="D4D4D4"/>
+          <w:sz w:val="21"/>
+          <w:szCs w:val="21"/>
+        </w:rPr>
+        <w:t>(</w:t>
+      </w:r>
+      <w:r>
+        <w:rPr>
+          <w:rFonts w:ascii="Consolas" w:eastAsia="Times New Roman" w:hAnsi="Consolas" w:cs="Times New Roman"/>
+          <w:color w:val="CE9178"/>
+          <w:sz w:val="21"/>
+          <w:szCs w:val="21"/>
+        </w:rPr>
+        <w:t>'roles_module'</w:t>
+      </w:r>
+      <w:r>
+        <w:rPr>
+          <w:rFonts w:ascii="Consolas" w:eastAsia="Times New Roman" w:hAnsi="Consolas" w:cs="Times New Roman"/>
+          <w:color w:val="D4D4D4"/>
+          <w:sz w:val="21"/>
+          <w:szCs w:val="21"/>
+        </w:rPr>
+        <w:t>)-&gt;</w:t>
+      </w:r>
+      <w:r>
+        <w:rPr>
+          <w:rFonts w:ascii="Consolas" w:eastAsia="Times New Roman" w:hAnsi="Consolas" w:cs="Times New Roman"/>
+          <w:color w:val="DCDCAA"/>
+          <w:sz w:val="21"/>
+          <w:szCs w:val="21"/>
+        </w:rPr>
+        <w:t>first</w:t>
+      </w:r>
+      <w:r>
+        <w:rPr>
+          <w:rFonts w:ascii="Consolas" w:eastAsia="Times New Roman" w:hAnsi="Consolas" w:cs="Times New Roman"/>
+          <w:color w:val="D4D4D4"/>
+          <w:sz w:val="21"/>
+          <w:szCs w:val="21"/>
+        </w:rPr>
+        <w:t>();</w:t>
+      </w:r>
+    </w:p>
+    <w:p>
+      <w:pPr>
+        <w:pStyle w:val="ListParagraph"/>
+        <w:numPr>
+          <w:ilvl w:val="1"/>
+          <w:numId w:val="4"/>
+        </w:numPr>
+        <w:jc w:val="both"/>
+        <w:rPr>
+          <w:rFonts w:ascii="Times New Roman" w:hAnsi="Times New Roman" w:cs="Times New Roman"/>
+          <w:sz w:val="34"/>
+          <w:szCs w:val="34"/>
+        </w:rPr>
+      </w:pPr>
+      <w:r>
+        <w:rPr>
+          <w:rFonts w:ascii="Times New Roman" w:hAnsi="Times New Roman" w:cs="Times New Roman"/>
+          <w:sz w:val="34"/>
+          <w:szCs w:val="34"/>
+        </w:rPr>
+        <w:t>Sau đó chúng ta sẽ chuyển đổi lại dữ liệu từ chuỗi thành mảng, vì chúng ta lưu dữ liệu trong thuộc tính roles_module dưới dạng mảng.</w:t>
+      </w:r>
+    </w:p>
+    <w:p>
+      <w:pPr>
+        <w:pStyle w:val="ListParagraph"/>
+        <w:numPr>
+          <w:ilvl w:val="2"/>
+          <w:numId w:val="4"/>
+        </w:numPr>
+        <w:shd w:val="clear" w:color="auto" w:fill="1E1E1E"/>
+        <w:spacing w:after="0" w:line="285" w:lineRule="atLeast"/>
+        <w:rPr>
+          <w:rFonts w:ascii="Consolas" w:eastAsia="Times New Roman" w:hAnsi="Consolas" w:cs="Times New Roman"/>
+          <w:color w:val="D4D4D4"/>
+          <w:sz w:val="21"/>
+          <w:szCs w:val="21"/>
+        </w:rPr>
+      </w:pPr>
+      <w:r>
+        <w:rPr>
+          <w:rFonts w:ascii="Consolas" w:eastAsia="Times New Roman" w:hAnsi="Consolas" w:cs="Times New Roman"/>
+          <w:color w:val="9CDCFE"/>
+          <w:sz w:val="21"/>
+          <w:szCs w:val="21"/>
+        </w:rPr>
+        <w:t>$array</w:t>
+      </w:r>
+      <w:r>
+        <w:rPr>
+          <w:rFonts w:ascii="Consolas" w:eastAsia="Times New Roman" w:hAnsi="Consolas" w:cs="Times New Roman"/>
+          <w:color w:val="D4D4D4"/>
+          <w:sz w:val="21"/>
+          <w:szCs w:val="21"/>
+        </w:rPr>
+        <w:t>=</w:t>
+      </w:r>
+      <w:r>
+        <w:rPr>
+          <w:rFonts w:ascii="Consolas" w:eastAsia="Times New Roman" w:hAnsi="Consolas" w:cs="Times New Roman"/>
+          <w:color w:val="DCDCAA"/>
+          <w:sz w:val="21"/>
+          <w:szCs w:val="21"/>
+        </w:rPr>
+        <w:t>collect</w:t>
+      </w:r>
+      <w:r>
+        <w:rPr>
+          <w:rFonts w:ascii="Consolas" w:eastAsia="Times New Roman" w:hAnsi="Consolas" w:cs="Times New Roman"/>
+          <w:color w:val="D4D4D4"/>
+          <w:sz w:val="21"/>
+          <w:szCs w:val="21"/>
+        </w:rPr>
+        <w:t>(</w:t>
+      </w:r>
+      <w:r>
+        <w:rPr>
+          <w:rFonts w:ascii="Consolas" w:eastAsia="Times New Roman" w:hAnsi="Consolas" w:cs="Times New Roman"/>
+          <w:color w:val="DCDCAA"/>
+          <w:sz w:val="21"/>
+          <w:szCs w:val="21"/>
+        </w:rPr>
+        <w:t>explode</w:t>
+      </w:r>
+      <w:r>
+        <w:rPr>
+          <w:rFonts w:ascii="Consolas" w:eastAsia="Times New Roman" w:hAnsi="Consolas" w:cs="Times New Roman"/>
+          <w:color w:val="D4D4D4"/>
+          <w:sz w:val="21"/>
+          <w:szCs w:val="21"/>
+        </w:rPr>
+        <w:t>(</w:t>
+      </w:r>
+      <w:r>
+        <w:rPr>
+          <w:rFonts w:ascii="Consolas" w:eastAsia="Times New Roman" w:hAnsi="Consolas" w:cs="Times New Roman"/>
+          <w:color w:val="CE9178"/>
+          <w:sz w:val="21"/>
+          <w:szCs w:val="21"/>
+        </w:rPr>
+        <w:t>",</w:t>
+      </w:r>
+      <w:proofErr w:type="gramStart"/>
+      <w:r>
+        <w:rPr>
+          <w:rFonts w:ascii="Consolas" w:eastAsia="Times New Roman" w:hAnsi="Consolas" w:cs="Times New Roman"/>
+          <w:color w:val="CE9178"/>
+          <w:sz w:val="21"/>
+          <w:szCs w:val="21"/>
+        </w:rPr>
+        <w:t>"</w:t>
+      </w:r>
+      <w:r>
+        <w:rPr>
+          <w:rFonts w:ascii="Consolas" w:eastAsia="Times New Roman" w:hAnsi="Consolas" w:cs="Times New Roman"/>
+          <w:color w:val="D4D4D4"/>
+          <w:sz w:val="21"/>
+          <w:szCs w:val="21"/>
+        </w:rPr>
+        <w:t>,</w:t>
+      </w:r>
+      <w:r>
+        <w:rPr>
+          <w:rFonts w:ascii="Consolas" w:eastAsia="Times New Roman" w:hAnsi="Consolas" w:cs="Times New Roman"/>
+          <w:color w:val="9CDCFE"/>
+          <w:sz w:val="21"/>
+          <w:szCs w:val="21"/>
+        </w:rPr>
+        <w:t>$</w:t>
+      </w:r>
+      <w:proofErr w:type="gramEnd"/>
+      <w:r>
+        <w:rPr>
+          <w:rFonts w:ascii="Consolas" w:eastAsia="Times New Roman" w:hAnsi="Consolas" w:cs="Times New Roman"/>
+          <w:color w:val="9CDCFE"/>
+          <w:sz w:val="21"/>
+          <w:szCs w:val="21"/>
+        </w:rPr>
+        <w:t>checkArray</w:t>
+      </w:r>
+      <w:r>
+        <w:rPr>
+          <w:rFonts w:ascii="Consolas" w:eastAsia="Times New Roman" w:hAnsi="Consolas" w:cs="Times New Roman"/>
+          <w:color w:val="D4D4D4"/>
+          <w:sz w:val="21"/>
+          <w:szCs w:val="21"/>
+        </w:rPr>
+        <w:t>));</w:t>
+      </w:r>
+    </w:p>
+    <w:p>
+      <w:pPr>
+        <w:pStyle w:val="ListParagraph"/>
+        <w:numPr>
+          <w:ilvl w:val="1"/>
+          <w:numId w:val="4"/>
+        </w:numPr>
+        <w:jc w:val="both"/>
+        <w:rPr>
+          <w:rFonts w:ascii="Times New Roman" w:hAnsi="Times New Roman" w:cs="Times New Roman"/>
+          <w:sz w:val="34"/>
+          <w:szCs w:val="34"/>
+        </w:rPr>
+      </w:pPr>
+      <w:r>
+        <w:rPr>
+          <w:rFonts w:ascii="Times New Roman" w:hAnsi="Times New Roman" w:cs="Times New Roman"/>
+          <w:sz w:val="34"/>
+          <w:szCs w:val="34"/>
+        </w:rPr>
+        <w:t>Tiếp tục chúng ta sẽ kiểm tra các điều kiện sử dụng hàm contains để so sánh các phần tử trong mảng</w:t>
+      </w:r>
+      <w:r>
+        <w:rPr>
+          <w:rFonts w:ascii="Times New Roman" w:hAnsi="Times New Roman" w:cs="Times New Roman"/>
+          <w:sz w:val="34"/>
+          <w:szCs w:val="34"/>
+        </w:rPr>
+        <w:t>, biến</w:t>
+      </w:r>
+      <w:r>
+        <w:rPr>
+          <w:rFonts w:ascii="Times New Roman" w:hAnsi="Times New Roman" w:cs="Times New Roman"/>
+          <w:sz w:val="34"/>
+          <w:szCs w:val="34"/>
+        </w:rPr>
+        <w:t xml:space="preserve"> </w:t>
+      </w:r>
+      <w:r>
+        <w:rPr>
+          <w:rFonts w:ascii="Consolas" w:eastAsia="Times New Roman" w:hAnsi="Consolas" w:cs="Times New Roman"/>
+          <w:color w:val="9CDCFE"/>
+          <w:sz w:val="21"/>
+          <w:szCs w:val="21"/>
+          <w:highlight w:val="black"/>
+        </w:rPr>
+        <w:t>$permission</w:t>
+      </w:r>
+      <w:r>
+        <w:rPr>
+          <w:rFonts w:ascii="Consolas" w:eastAsia="Times New Roman" w:hAnsi="Consolas" w:cs="Times New Roman"/>
+          <w:color w:val="9CDCFE"/>
+          <w:sz w:val="21"/>
+          <w:szCs w:val="21"/>
+        </w:rPr>
+        <w:t xml:space="preserve"> </w:t>
+      </w:r>
+      <w:r>
+        <w:rPr>
+          <w:rFonts w:ascii="Times New Roman" w:eastAsia="Times New Roman" w:hAnsi="Times New Roman" w:cs="Times New Roman"/>
+          <w:sz w:val="34"/>
+          <w:szCs w:val="34"/>
+        </w:rPr>
+        <w:t xml:space="preserve">được truyền </w:t>
+      </w:r>
+      <w:proofErr w:type="gramStart"/>
+      <w:r>
+        <w:rPr>
+          <w:rFonts w:ascii="Times New Roman" w:eastAsia="Times New Roman" w:hAnsi="Times New Roman" w:cs="Times New Roman"/>
+          <w:sz w:val="34"/>
+          <w:szCs w:val="34"/>
+        </w:rPr>
+        <w:t>từ  router</w:t>
+      </w:r>
+      <w:proofErr w:type="gramEnd"/>
+      <w:r>
+        <w:rPr>
+          <w:rFonts w:ascii="Times New Roman" w:eastAsia="Times New Roman" w:hAnsi="Times New Roman" w:cs="Times New Roman"/>
+          <w:sz w:val="34"/>
+          <w:szCs w:val="34"/>
+        </w:rPr>
+        <w:t xml:space="preserve"> qua và được khai báo trong functions của handle.</w:t>
+      </w:r>
+    </w:p>
+    <w:p>
+      <w:pPr>
+        <w:pStyle w:val="ListParagraph"/>
+        <w:numPr>
+          <w:ilvl w:val="2"/>
+          <w:numId w:val="4"/>
+        </w:numPr>
+        <w:shd w:val="clear" w:color="auto" w:fill="1E1E1E"/>
+        <w:spacing w:after="0" w:line="285" w:lineRule="atLeast"/>
+        <w:rPr>
+          <w:rFonts w:ascii="Consolas" w:eastAsia="Times New Roman" w:hAnsi="Consolas" w:cs="Times New Roman"/>
+          <w:color w:val="D4D4D4"/>
+          <w:sz w:val="21"/>
+          <w:szCs w:val="21"/>
+        </w:rPr>
+      </w:pPr>
+      <w:r>
+        <w:rPr>
+          <w:rFonts w:ascii="Consolas" w:eastAsia="Times New Roman" w:hAnsi="Consolas" w:cs="Times New Roman"/>
+          <w:color w:val="D4D4D4"/>
+          <w:sz w:val="21"/>
+          <w:szCs w:val="21"/>
+        </w:rPr>
+        <w:t xml:space="preserve">    </w:t>
+      </w:r>
+      <w:r>
+        <w:rPr>
+          <w:rFonts w:ascii="Consolas" w:eastAsia="Times New Roman" w:hAnsi="Consolas" w:cs="Times New Roman"/>
+          <w:color w:val="569CD6"/>
+          <w:sz w:val="21"/>
+          <w:szCs w:val="21"/>
+        </w:rPr>
+        <w:t>public</w:t>
+      </w:r>
+      <w:r>
+        <w:rPr>
+          <w:rFonts w:ascii="Consolas" w:eastAsia="Times New Roman" w:hAnsi="Consolas" w:cs="Times New Roman"/>
+          <w:color w:val="D4D4D4"/>
+          <w:sz w:val="21"/>
+          <w:szCs w:val="21"/>
+        </w:rPr>
+        <w:t xml:space="preserve"> </w:t>
+      </w:r>
+      <w:r>
+        <w:rPr>
+          <w:rFonts w:ascii="Consolas" w:eastAsia="Times New Roman" w:hAnsi="Consolas" w:cs="Times New Roman"/>
+          <w:color w:val="569CD6"/>
+          <w:sz w:val="21"/>
+          <w:szCs w:val="21"/>
+        </w:rPr>
+        <w:t>function</w:t>
+      </w:r>
+      <w:r>
+        <w:rPr>
+          <w:rFonts w:ascii="Consolas" w:eastAsia="Times New Roman" w:hAnsi="Consolas" w:cs="Times New Roman"/>
+          <w:color w:val="D4D4D4"/>
+          <w:sz w:val="21"/>
+          <w:szCs w:val="21"/>
+        </w:rPr>
+        <w:t xml:space="preserve"> </w:t>
+      </w:r>
+      <w:proofErr w:type="gramStart"/>
+      <w:r>
+        <w:rPr>
+          <w:rFonts w:ascii="Consolas" w:eastAsia="Times New Roman" w:hAnsi="Consolas" w:cs="Times New Roman"/>
+          <w:color w:val="DCDCAA"/>
+          <w:sz w:val="21"/>
+          <w:szCs w:val="21"/>
+        </w:rPr>
+        <w:t>handle</w:t>
+      </w:r>
+      <w:r>
+        <w:rPr>
+          <w:rFonts w:ascii="Consolas" w:eastAsia="Times New Roman" w:hAnsi="Consolas" w:cs="Times New Roman"/>
+          <w:color w:val="D4D4D4"/>
+          <w:sz w:val="21"/>
+          <w:szCs w:val="21"/>
+        </w:rPr>
+        <w:t>(</w:t>
+      </w:r>
+      <w:proofErr w:type="gramEnd"/>
+      <w:r>
+        <w:rPr>
+          <w:rFonts w:ascii="Consolas" w:eastAsia="Times New Roman" w:hAnsi="Consolas" w:cs="Times New Roman"/>
+          <w:color w:val="4EC9B0"/>
+          <w:sz w:val="21"/>
+          <w:szCs w:val="21"/>
+        </w:rPr>
+        <w:t>Request</w:t>
+      </w:r>
+      <w:r>
+        <w:rPr>
+          <w:rFonts w:ascii="Consolas" w:eastAsia="Times New Roman" w:hAnsi="Consolas" w:cs="Times New Roman"/>
+          <w:color w:val="D4D4D4"/>
+          <w:sz w:val="21"/>
+          <w:szCs w:val="21"/>
+        </w:rPr>
+        <w:t xml:space="preserve"> </w:t>
+      </w:r>
+      <w:r>
+        <w:rPr>
+          <w:rFonts w:ascii="Consolas" w:eastAsia="Times New Roman" w:hAnsi="Consolas" w:cs="Times New Roman"/>
+          <w:color w:val="9CDCFE"/>
+          <w:sz w:val="21"/>
+          <w:szCs w:val="21"/>
+        </w:rPr>
+        <w:t>$request</w:t>
+      </w:r>
+      <w:r>
+        <w:rPr>
+          <w:rFonts w:ascii="Consolas" w:eastAsia="Times New Roman" w:hAnsi="Consolas" w:cs="Times New Roman"/>
+          <w:color w:val="D4D4D4"/>
+          <w:sz w:val="21"/>
+          <w:szCs w:val="21"/>
+        </w:rPr>
+        <w:t xml:space="preserve">, </w:t>
+      </w:r>
+      <w:r>
+        <w:rPr>
+          <w:rFonts w:ascii="Consolas" w:eastAsia="Times New Roman" w:hAnsi="Consolas" w:cs="Times New Roman"/>
+          <w:color w:val="4EC9B0"/>
+          <w:sz w:val="21"/>
+          <w:szCs w:val="21"/>
+        </w:rPr>
+        <w:t>Closure</w:t>
+      </w:r>
+      <w:r>
+        <w:rPr>
+          <w:rFonts w:ascii="Consolas" w:eastAsia="Times New Roman" w:hAnsi="Consolas" w:cs="Times New Roman"/>
+          <w:color w:val="D4D4D4"/>
+          <w:sz w:val="21"/>
+          <w:szCs w:val="21"/>
+        </w:rPr>
+        <w:t xml:space="preserve"> </w:t>
+      </w:r>
+      <w:r>
+        <w:rPr>
+          <w:rFonts w:ascii="Consolas" w:eastAsia="Times New Roman" w:hAnsi="Consolas" w:cs="Times New Roman"/>
+          <w:color w:val="9CDCFE"/>
+          <w:sz w:val="21"/>
+          <w:szCs w:val="21"/>
+        </w:rPr>
+        <w:t>$next</w:t>
+      </w:r>
+      <w:r>
+        <w:rPr>
+          <w:rFonts w:ascii="Consolas" w:eastAsia="Times New Roman" w:hAnsi="Consolas" w:cs="Times New Roman"/>
+          <w:color w:val="D4D4D4"/>
+          <w:sz w:val="21"/>
+          <w:szCs w:val="21"/>
+        </w:rPr>
+        <w:t xml:space="preserve">, </w:t>
+      </w:r>
+      <w:r>
+        <w:rPr>
+          <w:rFonts w:ascii="Consolas" w:eastAsia="Times New Roman" w:hAnsi="Consolas" w:cs="Times New Roman"/>
+          <w:color w:val="9CDCFE"/>
+          <w:sz w:val="21"/>
+          <w:szCs w:val="21"/>
+        </w:rPr>
+        <w:t>$permission</w:t>
+      </w:r>
+      <w:r>
+        <w:rPr>
+          <w:rFonts w:ascii="Consolas" w:eastAsia="Times New Roman" w:hAnsi="Consolas" w:cs="Times New Roman"/>
+          <w:color w:val="D4D4D4"/>
+          <w:sz w:val="21"/>
+          <w:szCs w:val="21"/>
+        </w:rPr>
+        <w:t xml:space="preserve"> = </w:t>
+      </w:r>
+      <w:r>
+        <w:rPr>
+          <w:rFonts w:ascii="Consolas" w:eastAsia="Times New Roman" w:hAnsi="Consolas" w:cs="Times New Roman"/>
+          <w:color w:val="569CD6"/>
+          <w:sz w:val="21"/>
+          <w:szCs w:val="21"/>
+        </w:rPr>
+        <w:t>null</w:t>
+      </w:r>
+      <w:r>
+        <w:rPr>
+          <w:rFonts w:ascii="Consolas" w:eastAsia="Times New Roman" w:hAnsi="Consolas" w:cs="Times New Roman"/>
+          <w:color w:val="D4D4D4"/>
+          <w:sz w:val="21"/>
+          <w:szCs w:val="21"/>
+        </w:rPr>
+        <w:t>)</w:t>
+      </w:r>
+    </w:p>
+    <w:p>
+      <w:pPr>
+        <w:jc w:val="both"/>
+        <w:rPr>
+          <w:rFonts w:ascii="Times New Roman" w:hAnsi="Times New Roman" w:cs="Times New Roman"/>
+          <w:sz w:val="34"/>
+          <w:szCs w:val="34"/>
+        </w:rPr>
+      </w:pPr>
+    </w:p>
+    <w:p>
+      <w:pPr>
+        <w:pStyle w:val="ListParagraph"/>
+        <w:numPr>
+          <w:ilvl w:val="2"/>
+          <w:numId w:val="4"/>
+        </w:numPr>
+        <w:shd w:val="clear" w:color="auto" w:fill="1E1E1E"/>
+        <w:spacing w:after="0" w:line="285" w:lineRule="atLeast"/>
+        <w:rPr>
+          <w:rFonts w:ascii="Consolas" w:eastAsia="Times New Roman" w:hAnsi="Consolas" w:cs="Times New Roman"/>
+          <w:color w:val="D4D4D4"/>
+          <w:sz w:val="21"/>
+          <w:szCs w:val="21"/>
+        </w:rPr>
+      </w:pPr>
+      <w:r>
+        <w:rPr>
+          <w:rFonts w:ascii="Consolas" w:eastAsia="Times New Roman" w:hAnsi="Consolas" w:cs="Times New Roman"/>
+          <w:color w:val="D4D4D4"/>
+          <w:sz w:val="21"/>
+          <w:szCs w:val="21"/>
+        </w:rPr>
+        <w:t>     </w:t>
+      </w:r>
+    </w:p>
+    <w:p>
+      <w:pPr>
+        <w:pStyle w:val="ListParagraph"/>
+        <w:numPr>
+          <w:ilvl w:val="2"/>
+          <w:numId w:val="4"/>
+        </w:numPr>
+        <w:shd w:val="clear" w:color="auto" w:fill="1E1E1E"/>
+        <w:spacing w:after="0" w:line="285" w:lineRule="atLeast"/>
+        <w:rPr>
+          <w:rFonts w:ascii="Consolas" w:eastAsia="Times New Roman" w:hAnsi="Consolas" w:cs="Times New Roman"/>
+          <w:color w:val="D4D4D4"/>
+          <w:sz w:val="21"/>
+          <w:szCs w:val="21"/>
+        </w:rPr>
+      </w:pPr>
+      <w:r>
+        <w:rPr>
+          <w:rFonts w:ascii="Consolas" w:eastAsia="Times New Roman" w:hAnsi="Consolas" w:cs="Times New Roman"/>
+          <w:color w:val="D4D4D4"/>
+          <w:sz w:val="21"/>
+          <w:szCs w:val="21"/>
+        </w:rPr>
+        <w:t xml:space="preserve">        </w:t>
+      </w:r>
+      <w:r>
+        <w:rPr>
+          <w:rFonts w:ascii="Consolas" w:eastAsia="Times New Roman" w:hAnsi="Consolas" w:cs="Times New Roman"/>
+          <w:color w:val="C586C0"/>
+          <w:sz w:val="21"/>
+          <w:szCs w:val="21"/>
+        </w:rPr>
+        <w:t>if</w:t>
+      </w:r>
+      <w:r>
+        <w:rPr>
+          <w:rFonts w:ascii="Consolas" w:eastAsia="Times New Roman" w:hAnsi="Consolas" w:cs="Times New Roman"/>
+          <w:color w:val="D4D4D4"/>
+          <w:sz w:val="21"/>
+          <w:szCs w:val="21"/>
+        </w:rPr>
+        <w:t>(</w:t>
+      </w:r>
+      <w:r>
+        <w:rPr>
+          <w:rFonts w:ascii="Consolas" w:eastAsia="Times New Roman" w:hAnsi="Consolas" w:cs="Times New Roman"/>
+          <w:color w:val="9CDCFE"/>
+          <w:sz w:val="21"/>
+          <w:szCs w:val="21"/>
+        </w:rPr>
+        <w:t>$array</w:t>
+      </w:r>
+      <w:r>
+        <w:rPr>
+          <w:rFonts w:ascii="Consolas" w:eastAsia="Times New Roman" w:hAnsi="Consolas" w:cs="Times New Roman"/>
+          <w:color w:val="D4D4D4"/>
+          <w:sz w:val="21"/>
+          <w:szCs w:val="21"/>
+        </w:rPr>
+        <w:t>-&gt;</w:t>
+      </w:r>
+      <w:r>
+        <w:rPr>
+          <w:rFonts w:ascii="Consolas" w:eastAsia="Times New Roman" w:hAnsi="Consolas" w:cs="Times New Roman"/>
+          <w:color w:val="DCDCAA"/>
+          <w:sz w:val="21"/>
+          <w:szCs w:val="21"/>
+        </w:rPr>
+        <w:t>contains</w:t>
+      </w:r>
+      <w:r>
+        <w:rPr>
+          <w:rFonts w:ascii="Consolas" w:eastAsia="Times New Roman" w:hAnsi="Consolas" w:cs="Times New Roman"/>
+          <w:color w:val="D4D4D4"/>
+          <w:sz w:val="21"/>
+          <w:szCs w:val="21"/>
+        </w:rPr>
+        <w:t>(</w:t>
+      </w:r>
+      <w:r>
+        <w:rPr>
+          <w:rFonts w:ascii="Consolas" w:eastAsia="Times New Roman" w:hAnsi="Consolas" w:cs="Times New Roman"/>
+          <w:color w:val="9CDCFE"/>
+          <w:sz w:val="21"/>
+          <w:szCs w:val="21"/>
+        </w:rPr>
+        <w:t>$permission</w:t>
+      </w:r>
+      <w:proofErr w:type="gramStart"/>
+      <w:r>
+        <w:rPr>
+          <w:rFonts w:ascii="Consolas" w:eastAsia="Times New Roman" w:hAnsi="Consolas" w:cs="Times New Roman"/>
+          <w:color w:val="D4D4D4"/>
+          <w:sz w:val="21"/>
+          <w:szCs w:val="21"/>
+        </w:rPr>
+        <w:t>)){</w:t>
+      </w:r>
+      <w:proofErr w:type="gramEnd"/>
+    </w:p>
+    <w:p>
+      <w:pPr>
+        <w:pStyle w:val="ListParagraph"/>
+        <w:numPr>
+          <w:ilvl w:val="2"/>
+          <w:numId w:val="4"/>
+        </w:numPr>
+        <w:shd w:val="clear" w:color="auto" w:fill="1E1E1E"/>
+        <w:spacing w:after="0" w:line="285" w:lineRule="atLeast"/>
+        <w:rPr>
+          <w:rFonts w:ascii="Consolas" w:eastAsia="Times New Roman" w:hAnsi="Consolas" w:cs="Times New Roman"/>
+          <w:color w:val="D4D4D4"/>
+          <w:sz w:val="21"/>
+          <w:szCs w:val="21"/>
+        </w:rPr>
+      </w:pPr>
+      <w:r>
+        <w:rPr>
+          <w:rFonts w:ascii="Consolas" w:eastAsia="Times New Roman" w:hAnsi="Consolas" w:cs="Times New Roman"/>
+          <w:color w:val="D4D4D4"/>
+          <w:sz w:val="21"/>
+          <w:szCs w:val="21"/>
+        </w:rPr>
+        <w:t xml:space="preserve">            </w:t>
+      </w:r>
+      <w:r>
+        <w:rPr>
+          <w:rFonts w:ascii="Consolas" w:eastAsia="Times New Roman" w:hAnsi="Consolas" w:cs="Times New Roman"/>
+          <w:color w:val="C586C0"/>
+          <w:sz w:val="21"/>
+          <w:szCs w:val="21"/>
+        </w:rPr>
+        <w:t>return</w:t>
+      </w:r>
+      <w:r>
+        <w:rPr>
+          <w:rFonts w:ascii="Consolas" w:eastAsia="Times New Roman" w:hAnsi="Consolas" w:cs="Times New Roman"/>
+          <w:color w:val="D4D4D4"/>
+          <w:sz w:val="21"/>
+          <w:szCs w:val="21"/>
+        </w:rPr>
+        <w:t xml:space="preserve"> </w:t>
+      </w:r>
+      <w:r>
+        <w:rPr>
+          <w:rFonts w:ascii="Consolas" w:eastAsia="Times New Roman" w:hAnsi="Consolas" w:cs="Times New Roman"/>
+          <w:color w:val="9CDCFE"/>
+          <w:sz w:val="21"/>
+          <w:szCs w:val="21"/>
+        </w:rPr>
+        <w:t>$next</w:t>
+      </w:r>
+      <w:r>
+        <w:rPr>
+          <w:rFonts w:ascii="Consolas" w:eastAsia="Times New Roman" w:hAnsi="Consolas" w:cs="Times New Roman"/>
+          <w:color w:val="D4D4D4"/>
+          <w:sz w:val="21"/>
+          <w:szCs w:val="21"/>
+        </w:rPr>
+        <w:t>(</w:t>
+      </w:r>
+      <w:r>
+        <w:rPr>
+          <w:rFonts w:ascii="Consolas" w:eastAsia="Times New Roman" w:hAnsi="Consolas" w:cs="Times New Roman"/>
+          <w:color w:val="9CDCFE"/>
+          <w:sz w:val="21"/>
+          <w:szCs w:val="21"/>
+        </w:rPr>
+        <w:t>$request</w:t>
+      </w:r>
+      <w:r>
+        <w:rPr>
+          <w:rFonts w:ascii="Consolas" w:eastAsia="Times New Roman" w:hAnsi="Consolas" w:cs="Times New Roman"/>
+          <w:color w:val="D4D4D4"/>
+          <w:sz w:val="21"/>
+          <w:szCs w:val="21"/>
+        </w:rPr>
+        <w:t>);</w:t>
+      </w:r>
+    </w:p>
+    <w:p>
+      <w:pPr>
+        <w:pStyle w:val="ListParagraph"/>
+        <w:numPr>
+          <w:ilvl w:val="2"/>
+          <w:numId w:val="4"/>
+        </w:numPr>
+        <w:shd w:val="clear" w:color="auto" w:fill="1E1E1E"/>
+        <w:spacing w:after="0" w:line="285" w:lineRule="atLeast"/>
+        <w:rPr>
+          <w:rFonts w:ascii="Consolas" w:eastAsia="Times New Roman" w:hAnsi="Consolas" w:cs="Times New Roman"/>
+          <w:color w:val="D4D4D4"/>
+          <w:sz w:val="21"/>
+          <w:szCs w:val="21"/>
+        </w:rPr>
+      </w:pPr>
+      <w:r>
+        <w:rPr>
+          <w:rFonts w:ascii="Consolas" w:eastAsia="Times New Roman" w:hAnsi="Consolas" w:cs="Times New Roman"/>
+          <w:color w:val="D4D4D4"/>
+          <w:sz w:val="21"/>
+          <w:szCs w:val="21"/>
+        </w:rPr>
+        <w:t>        }</w:t>
+      </w:r>
+    </w:p>
+    <w:p>
+      <w:pPr>
+        <w:pStyle w:val="ListParagraph"/>
+        <w:numPr>
+          <w:ilvl w:val="1"/>
+          <w:numId w:val="4"/>
+        </w:numPr>
+        <w:jc w:val="both"/>
+        <w:rPr>
+          <w:rFonts w:ascii="Times New Roman" w:hAnsi="Times New Roman" w:cs="Times New Roman"/>
+          <w:sz w:val="34"/>
+          <w:szCs w:val="34"/>
+        </w:rPr>
+      </w:pPr>
+      <w:r>
+        <w:rPr>
+          <w:rFonts w:ascii="Times New Roman" w:hAnsi="Times New Roman" w:cs="Times New Roman"/>
+          <w:sz w:val="34"/>
+          <w:szCs w:val="34"/>
+        </w:rPr>
+        <w:t xml:space="preserve">Nếu thất bại chúng ta sẽ chuyển hướng về lại trang đó, sử dụng hàm </w:t>
+      </w:r>
+      <w:r>
+        <w:rPr>
+          <w:rFonts w:ascii="Consolas" w:eastAsia="Times New Roman" w:hAnsi="Consolas" w:cs="Times New Roman"/>
+          <w:color w:val="9CDCFE"/>
+          <w:sz w:val="21"/>
+          <w:szCs w:val="21"/>
+          <w:highlight w:val="black"/>
+        </w:rPr>
+        <w:t>$_SERVER</w:t>
+      </w:r>
+      <w:r>
+        <w:rPr>
+          <w:rFonts w:ascii="Consolas" w:eastAsia="Times New Roman" w:hAnsi="Consolas" w:cs="Times New Roman"/>
+          <w:color w:val="D4D4D4"/>
+          <w:sz w:val="21"/>
+          <w:szCs w:val="21"/>
+          <w:highlight w:val="black"/>
+        </w:rPr>
+        <w:t>[</w:t>
+      </w:r>
+      <w:r>
+        <w:rPr>
+          <w:rFonts w:ascii="Consolas" w:eastAsia="Times New Roman" w:hAnsi="Consolas" w:cs="Times New Roman"/>
+          <w:color w:val="CE9178"/>
+          <w:sz w:val="21"/>
+          <w:szCs w:val="21"/>
+          <w:highlight w:val="black"/>
+        </w:rPr>
+        <w:t>'REQUEST_URI'</w:t>
+      </w:r>
+      <w:r>
+        <w:rPr>
+          <w:rFonts w:ascii="Consolas" w:eastAsia="Times New Roman" w:hAnsi="Consolas" w:cs="Times New Roman"/>
+          <w:color w:val="D4D4D4"/>
+          <w:sz w:val="21"/>
+          <w:szCs w:val="21"/>
+          <w:highlight w:val="black"/>
+        </w:rPr>
+        <w:t>];</w:t>
+      </w:r>
+      <w:r>
+        <w:rPr>
+          <w:rFonts w:ascii="Consolas" w:eastAsia="Times New Roman" w:hAnsi="Consolas" w:cs="Times New Roman"/>
+          <w:color w:val="D4D4D4"/>
+          <w:sz w:val="21"/>
+          <w:szCs w:val="21"/>
+        </w:rPr>
+        <w:t xml:space="preserve"> </w:t>
+      </w:r>
+      <w:r>
+        <w:rPr>
+          <w:rFonts w:ascii="Times New Roman" w:eastAsia="Times New Roman" w:hAnsi="Times New Roman" w:cs="Times New Roman"/>
+          <w:sz w:val="34"/>
+          <w:szCs w:val="34"/>
+        </w:rPr>
+        <w:t>để lấy được đường dẫn trang đang hoạt động, sau đó chúng ta sẽ điều hướng về lại những trang đó và kèm theo thông báo lỗi.</w:t>
+      </w:r>
+    </w:p>
+    <w:p>
+      <w:pPr>
+        <w:pStyle w:val="ListParagraph"/>
+        <w:numPr>
+          <w:ilvl w:val="2"/>
+          <w:numId w:val="4"/>
+        </w:numPr>
+        <w:shd w:val="clear" w:color="auto" w:fill="1E1E1E"/>
+        <w:spacing w:after="0" w:line="285" w:lineRule="atLeast"/>
+        <w:rPr>
+          <w:rFonts w:ascii="Consolas" w:eastAsia="Times New Roman" w:hAnsi="Consolas" w:cs="Times New Roman"/>
+          <w:color w:val="D4D4D4"/>
+          <w:sz w:val="21"/>
+          <w:szCs w:val="21"/>
+        </w:rPr>
+      </w:pPr>
+      <w:r>
+        <w:rPr>
+          <w:rFonts w:ascii="Consolas" w:eastAsia="Times New Roman" w:hAnsi="Consolas" w:cs="Times New Roman"/>
+          <w:color w:val="D4D4D4"/>
+          <w:sz w:val="21"/>
+          <w:szCs w:val="21"/>
+        </w:rPr>
+        <w:t>   </w:t>
+      </w:r>
+      <w:r>
+        <w:rPr>
+          <w:rFonts w:ascii="Consolas" w:eastAsia="Times New Roman" w:hAnsi="Consolas" w:cs="Times New Roman"/>
+          <w:color w:val="9CDCFE"/>
+          <w:sz w:val="21"/>
+          <w:szCs w:val="21"/>
+        </w:rPr>
+        <w:t>$domain</w:t>
+      </w:r>
+      <w:r>
+        <w:rPr>
+          <w:rFonts w:ascii="Consolas" w:eastAsia="Times New Roman" w:hAnsi="Consolas" w:cs="Times New Roman"/>
+          <w:color w:val="D4D4D4"/>
+          <w:sz w:val="21"/>
+          <w:szCs w:val="21"/>
+        </w:rPr>
+        <w:t xml:space="preserve">= </w:t>
+      </w:r>
+      <w:r>
+        <w:rPr>
+          <w:rFonts w:ascii="Consolas" w:eastAsia="Times New Roman" w:hAnsi="Consolas" w:cs="Times New Roman"/>
+          <w:color w:val="9CDCFE"/>
+          <w:sz w:val="21"/>
+          <w:szCs w:val="21"/>
+        </w:rPr>
+        <w:t>$_SERVER</w:t>
+      </w:r>
+      <w:r>
+        <w:rPr>
+          <w:rFonts w:ascii="Consolas" w:eastAsia="Times New Roman" w:hAnsi="Consolas" w:cs="Times New Roman"/>
+          <w:color w:val="D4D4D4"/>
+          <w:sz w:val="21"/>
+          <w:szCs w:val="21"/>
+        </w:rPr>
+        <w:t>[</w:t>
+      </w:r>
+      <w:r>
+        <w:rPr>
+          <w:rFonts w:ascii="Consolas" w:eastAsia="Times New Roman" w:hAnsi="Consolas" w:cs="Times New Roman"/>
+          <w:color w:val="CE9178"/>
+          <w:sz w:val="21"/>
+          <w:szCs w:val="21"/>
+        </w:rPr>
+        <w:t>'REQUEST_URI'</w:t>
+      </w:r>
+      <w:r>
+        <w:rPr>
+          <w:rFonts w:ascii="Consolas" w:eastAsia="Times New Roman" w:hAnsi="Consolas" w:cs="Times New Roman"/>
+          <w:color w:val="D4D4D4"/>
+          <w:sz w:val="21"/>
+          <w:szCs w:val="21"/>
+        </w:rPr>
+        <w:t>];</w:t>
+      </w:r>
+    </w:p>
+    <w:p>
+      <w:pPr>
+        <w:pStyle w:val="ListParagraph"/>
+        <w:numPr>
+          <w:ilvl w:val="2"/>
+          <w:numId w:val="4"/>
+        </w:numPr>
+        <w:shd w:val="clear" w:color="auto" w:fill="1E1E1E"/>
+        <w:spacing w:after="0" w:line="285" w:lineRule="atLeast"/>
+        <w:rPr>
+          <w:rFonts w:ascii="Consolas" w:eastAsia="Times New Roman" w:hAnsi="Consolas" w:cs="Times New Roman"/>
+          <w:color w:val="D4D4D4"/>
+          <w:sz w:val="21"/>
+          <w:szCs w:val="21"/>
+        </w:rPr>
+      </w:pPr>
+      <w:r>
+        <w:rPr>
+          <w:rFonts w:ascii="Consolas" w:eastAsia="Times New Roman" w:hAnsi="Consolas" w:cs="Times New Roman"/>
+          <w:color w:val="D4D4D4"/>
+          <w:sz w:val="21"/>
+          <w:szCs w:val="21"/>
+        </w:rPr>
+        <w:t xml:space="preserve">        </w:t>
+      </w:r>
+      <w:proofErr w:type="gramStart"/>
+      <w:r>
+        <w:rPr>
+          <w:rFonts w:ascii="Consolas" w:eastAsia="Times New Roman" w:hAnsi="Consolas" w:cs="Times New Roman"/>
+          <w:color w:val="C586C0"/>
+          <w:sz w:val="21"/>
+          <w:szCs w:val="21"/>
+        </w:rPr>
+        <w:t>if</w:t>
+      </w:r>
+      <w:r>
+        <w:rPr>
+          <w:rFonts w:ascii="Consolas" w:eastAsia="Times New Roman" w:hAnsi="Consolas" w:cs="Times New Roman"/>
+          <w:color w:val="D4D4D4"/>
+          <w:sz w:val="21"/>
+          <w:szCs w:val="21"/>
+        </w:rPr>
+        <w:t>(</w:t>
+      </w:r>
+      <w:proofErr w:type="gramEnd"/>
+      <w:r>
+        <w:rPr>
+          <w:rFonts w:ascii="Consolas" w:eastAsia="Times New Roman" w:hAnsi="Consolas" w:cs="Times New Roman"/>
+          <w:color w:val="9CDCFE"/>
+          <w:sz w:val="21"/>
+          <w:szCs w:val="21"/>
+        </w:rPr>
+        <w:t>$permission</w:t>
+      </w:r>
+      <w:r>
+        <w:rPr>
+          <w:rFonts w:ascii="Consolas" w:eastAsia="Times New Roman" w:hAnsi="Consolas" w:cs="Times New Roman"/>
+          <w:color w:val="D4D4D4"/>
+          <w:sz w:val="21"/>
+          <w:szCs w:val="21"/>
+        </w:rPr>
+        <w:t>==</w:t>
+      </w:r>
+      <w:r>
+        <w:rPr>
+          <w:rFonts w:ascii="Consolas" w:eastAsia="Times New Roman" w:hAnsi="Consolas" w:cs="Times New Roman"/>
+          <w:color w:val="CE9178"/>
+          <w:sz w:val="21"/>
+          <w:szCs w:val="21"/>
+        </w:rPr>
+        <w:t>'user-list'</w:t>
+      </w:r>
+      <w:r>
+        <w:rPr>
+          <w:rFonts w:ascii="Consolas" w:eastAsia="Times New Roman" w:hAnsi="Consolas" w:cs="Times New Roman"/>
+          <w:color w:val="D4D4D4"/>
+          <w:sz w:val="21"/>
+          <w:szCs w:val="21"/>
+        </w:rPr>
+        <w:t xml:space="preserve"> || </w:t>
+      </w:r>
+      <w:r>
+        <w:rPr>
+          <w:rFonts w:ascii="Consolas" w:eastAsia="Times New Roman" w:hAnsi="Consolas" w:cs="Times New Roman"/>
+          <w:color w:val="9CDCFE"/>
+          <w:sz w:val="21"/>
+          <w:szCs w:val="21"/>
+        </w:rPr>
+        <w:t>$permission</w:t>
+      </w:r>
+      <w:r>
+        <w:rPr>
+          <w:rFonts w:ascii="Consolas" w:eastAsia="Times New Roman" w:hAnsi="Consolas" w:cs="Times New Roman"/>
+          <w:color w:val="D4D4D4"/>
+          <w:sz w:val="21"/>
+          <w:szCs w:val="21"/>
+        </w:rPr>
+        <w:t>==</w:t>
+      </w:r>
+      <w:r>
+        <w:rPr>
+          <w:rFonts w:ascii="Consolas" w:eastAsia="Times New Roman" w:hAnsi="Consolas" w:cs="Times New Roman"/>
+          <w:color w:val="CE9178"/>
+          <w:sz w:val="21"/>
+          <w:szCs w:val="21"/>
+        </w:rPr>
+        <w:t>'room-list'</w:t>
+      </w:r>
+      <w:r>
+        <w:rPr>
+          <w:rFonts w:ascii="Consolas" w:eastAsia="Times New Roman" w:hAnsi="Consolas" w:cs="Times New Roman"/>
+          <w:color w:val="D4D4D4"/>
+          <w:sz w:val="21"/>
+          <w:szCs w:val="21"/>
+        </w:rPr>
+        <w:t xml:space="preserve"> || </w:t>
+      </w:r>
+      <w:r>
+        <w:rPr>
+          <w:rFonts w:ascii="Consolas" w:eastAsia="Times New Roman" w:hAnsi="Consolas" w:cs="Times New Roman"/>
+          <w:color w:val="9CDCFE"/>
+          <w:sz w:val="21"/>
+          <w:szCs w:val="21"/>
+        </w:rPr>
+        <w:t>$permission</w:t>
+      </w:r>
+      <w:r>
+        <w:rPr>
+          <w:rFonts w:ascii="Consolas" w:eastAsia="Times New Roman" w:hAnsi="Consolas" w:cs="Times New Roman"/>
+          <w:color w:val="D4D4D4"/>
+          <w:sz w:val="21"/>
+          <w:szCs w:val="21"/>
+        </w:rPr>
+        <w:t>==</w:t>
+      </w:r>
+      <w:r>
+        <w:rPr>
+          <w:rFonts w:ascii="Consolas" w:eastAsia="Times New Roman" w:hAnsi="Consolas" w:cs="Times New Roman"/>
+          <w:color w:val="CE9178"/>
+          <w:sz w:val="21"/>
+          <w:szCs w:val="21"/>
+        </w:rPr>
+        <w:t>'role-list'</w:t>
+      </w:r>
+      <w:r>
+        <w:rPr>
+          <w:rFonts w:ascii="Consolas" w:eastAsia="Times New Roman" w:hAnsi="Consolas" w:cs="Times New Roman"/>
+          <w:color w:val="D4D4D4"/>
+          <w:sz w:val="21"/>
+          <w:szCs w:val="21"/>
+        </w:rPr>
+        <w:t>){</w:t>
+      </w:r>
+    </w:p>
+    <w:p>
+      <w:pPr>
+        <w:pStyle w:val="ListParagraph"/>
+        <w:numPr>
+          <w:ilvl w:val="2"/>
+          <w:numId w:val="4"/>
+        </w:numPr>
+        <w:shd w:val="clear" w:color="auto" w:fill="1E1E1E"/>
+        <w:spacing w:after="0" w:line="285" w:lineRule="atLeast"/>
+        <w:rPr>
+          <w:rFonts w:ascii="Consolas" w:eastAsia="Times New Roman" w:hAnsi="Consolas" w:cs="Times New Roman"/>
+          <w:color w:val="D4D4D4"/>
+          <w:sz w:val="21"/>
+          <w:szCs w:val="21"/>
+        </w:rPr>
+      </w:pPr>
+      <w:r>
+        <w:rPr>
+          <w:rFonts w:ascii="Consolas" w:eastAsia="Times New Roman" w:hAnsi="Consolas" w:cs="Times New Roman"/>
+          <w:color w:val="D4D4D4"/>
+          <w:sz w:val="21"/>
+          <w:szCs w:val="21"/>
+        </w:rPr>
+        <w:lastRenderedPageBreak/>
+        <w:t xml:space="preserve">          </w:t>
+      </w:r>
+      <w:r>
+        <w:rPr>
+          <w:rFonts w:ascii="Consolas" w:eastAsia="Times New Roman" w:hAnsi="Consolas" w:cs="Times New Roman"/>
+          <w:color w:val="C586C0"/>
+          <w:sz w:val="21"/>
+          <w:szCs w:val="21"/>
+        </w:rPr>
+        <w:t>return</w:t>
+      </w:r>
+      <w:r>
+        <w:rPr>
+          <w:rFonts w:ascii="Consolas" w:eastAsia="Times New Roman" w:hAnsi="Consolas" w:cs="Times New Roman"/>
+          <w:color w:val="D4D4D4"/>
+          <w:sz w:val="21"/>
+          <w:szCs w:val="21"/>
+        </w:rPr>
+        <w:t xml:space="preserve"> </w:t>
+      </w:r>
+      <w:r>
+        <w:rPr>
+          <w:rFonts w:ascii="Consolas" w:eastAsia="Times New Roman" w:hAnsi="Consolas" w:cs="Times New Roman"/>
+          <w:color w:val="DCDCAA"/>
+          <w:sz w:val="21"/>
+          <w:szCs w:val="21"/>
+        </w:rPr>
+        <w:t>redirect</w:t>
+      </w:r>
+      <w:r>
+        <w:rPr>
+          <w:rFonts w:ascii="Consolas" w:eastAsia="Times New Roman" w:hAnsi="Consolas" w:cs="Times New Roman"/>
+          <w:color w:val="D4D4D4"/>
+          <w:sz w:val="21"/>
+          <w:szCs w:val="21"/>
+        </w:rPr>
+        <w:t>(</w:t>
+      </w:r>
+      <w:r>
+        <w:rPr>
+          <w:rFonts w:ascii="Consolas" w:eastAsia="Times New Roman" w:hAnsi="Consolas" w:cs="Times New Roman"/>
+          <w:color w:val="CE9178"/>
+          <w:sz w:val="21"/>
+          <w:szCs w:val="21"/>
+        </w:rPr>
+        <w:t>'/admin-info'</w:t>
+      </w:r>
+      <w:r>
+        <w:rPr>
+          <w:rFonts w:ascii="Consolas" w:eastAsia="Times New Roman" w:hAnsi="Consolas" w:cs="Times New Roman"/>
+          <w:color w:val="D4D4D4"/>
+          <w:sz w:val="21"/>
+          <w:szCs w:val="21"/>
+        </w:rPr>
+        <w:t>)-&gt;</w:t>
+      </w:r>
+      <w:proofErr w:type="gramStart"/>
+      <w:r>
+        <w:rPr>
+          <w:rFonts w:ascii="Consolas" w:eastAsia="Times New Roman" w:hAnsi="Consolas" w:cs="Times New Roman"/>
+          <w:color w:val="DCDCAA"/>
+          <w:sz w:val="21"/>
+          <w:szCs w:val="21"/>
+        </w:rPr>
+        <w:t>with</w:t>
+      </w:r>
+      <w:r>
+        <w:rPr>
+          <w:rFonts w:ascii="Consolas" w:eastAsia="Times New Roman" w:hAnsi="Consolas" w:cs="Times New Roman"/>
+          <w:color w:val="D4D4D4"/>
+          <w:sz w:val="21"/>
+          <w:szCs w:val="21"/>
+        </w:rPr>
+        <w:t>(</w:t>
+      </w:r>
+      <w:proofErr w:type="gramEnd"/>
+      <w:r>
+        <w:rPr>
+          <w:rFonts w:ascii="Consolas" w:eastAsia="Times New Roman" w:hAnsi="Consolas" w:cs="Times New Roman"/>
+          <w:color w:val="CE9178"/>
+          <w:sz w:val="21"/>
+          <w:szCs w:val="21"/>
+        </w:rPr>
+        <w:t>'mess'</w:t>
+      </w:r>
+      <w:r>
+        <w:rPr>
+          <w:rFonts w:ascii="Consolas" w:eastAsia="Times New Roman" w:hAnsi="Consolas" w:cs="Times New Roman"/>
+          <w:color w:val="D4D4D4"/>
+          <w:sz w:val="21"/>
+          <w:szCs w:val="21"/>
+        </w:rPr>
+        <w:t xml:space="preserve">, </w:t>
+      </w:r>
+      <w:r>
+        <w:rPr>
+          <w:rFonts w:ascii="Consolas" w:eastAsia="Times New Roman" w:hAnsi="Consolas" w:cs="Times New Roman"/>
+          <w:color w:val="CE9178"/>
+          <w:sz w:val="21"/>
+          <w:szCs w:val="21"/>
+        </w:rPr>
+        <w:t>'Bạn không dùng được chức năng '</w:t>
+      </w:r>
+      <w:r>
+        <w:rPr>
+          <w:rFonts w:ascii="Consolas" w:eastAsia="Times New Roman" w:hAnsi="Consolas" w:cs="Times New Roman"/>
+          <w:color w:val="D4D4D4"/>
+          <w:sz w:val="21"/>
+          <w:szCs w:val="21"/>
+        </w:rPr>
+        <w:t>.</w:t>
+      </w:r>
+      <w:r>
+        <w:rPr>
+          <w:rFonts w:ascii="Consolas" w:eastAsia="Times New Roman" w:hAnsi="Consolas" w:cs="Times New Roman"/>
+          <w:color w:val="9CDCFE"/>
+          <w:sz w:val="21"/>
+          <w:szCs w:val="21"/>
+        </w:rPr>
+        <w:t>$permission</w:t>
+      </w:r>
+      <w:r>
+        <w:rPr>
+          <w:rFonts w:ascii="Consolas" w:eastAsia="Times New Roman" w:hAnsi="Consolas" w:cs="Times New Roman"/>
+          <w:color w:val="D4D4D4"/>
+          <w:sz w:val="21"/>
+          <w:szCs w:val="21"/>
+        </w:rPr>
+        <w:t>.</w:t>
+      </w:r>
+      <w:r>
+        <w:rPr>
+          <w:rFonts w:ascii="Consolas" w:eastAsia="Times New Roman" w:hAnsi="Consolas" w:cs="Times New Roman"/>
+          <w:color w:val="CE9178"/>
+          <w:sz w:val="21"/>
+          <w:szCs w:val="21"/>
+        </w:rPr>
+        <w:t>'!'</w:t>
+      </w:r>
+      <w:r>
+        <w:rPr>
+          <w:rFonts w:ascii="Consolas" w:eastAsia="Times New Roman" w:hAnsi="Consolas" w:cs="Times New Roman"/>
+          <w:color w:val="D4D4D4"/>
+          <w:sz w:val="21"/>
+          <w:szCs w:val="21"/>
+        </w:rPr>
+        <w:t>);</w:t>
+      </w:r>
+    </w:p>
+    <w:p>
+      <w:pPr>
+        <w:pStyle w:val="ListParagraph"/>
+        <w:numPr>
+          <w:ilvl w:val="2"/>
+          <w:numId w:val="4"/>
+        </w:numPr>
+        <w:shd w:val="clear" w:color="auto" w:fill="1E1E1E"/>
+        <w:spacing w:after="0" w:line="285" w:lineRule="atLeast"/>
+        <w:rPr>
+          <w:rFonts w:ascii="Consolas" w:eastAsia="Times New Roman" w:hAnsi="Consolas" w:cs="Times New Roman"/>
+          <w:color w:val="D4D4D4"/>
+          <w:sz w:val="21"/>
+          <w:szCs w:val="21"/>
+        </w:rPr>
+      </w:pPr>
+      <w:r>
+        <w:rPr>
+          <w:rFonts w:ascii="Consolas" w:eastAsia="Times New Roman" w:hAnsi="Consolas" w:cs="Times New Roman"/>
+          <w:color w:val="D4D4D4"/>
+          <w:sz w:val="21"/>
+          <w:szCs w:val="21"/>
+        </w:rPr>
+        <w:t>        }</w:t>
+      </w:r>
+    </w:p>
+    <w:p>
+      <w:pPr>
+        <w:pStyle w:val="ListParagraph"/>
+        <w:numPr>
+          <w:ilvl w:val="2"/>
+          <w:numId w:val="4"/>
+        </w:numPr>
+        <w:shd w:val="clear" w:color="auto" w:fill="1E1E1E"/>
+        <w:spacing w:after="0" w:line="285" w:lineRule="atLeast"/>
+        <w:rPr>
+          <w:rFonts w:ascii="Consolas" w:eastAsia="Times New Roman" w:hAnsi="Consolas" w:cs="Times New Roman"/>
+          <w:color w:val="D4D4D4"/>
+          <w:sz w:val="21"/>
+          <w:szCs w:val="21"/>
+        </w:rPr>
+      </w:pPr>
+      <w:r>
+        <w:rPr>
+          <w:rFonts w:ascii="Consolas" w:eastAsia="Times New Roman" w:hAnsi="Consolas" w:cs="Times New Roman"/>
+          <w:color w:val="D4D4D4"/>
+          <w:sz w:val="21"/>
+          <w:szCs w:val="21"/>
+        </w:rPr>
+        <w:t xml:space="preserve">        </w:t>
+      </w:r>
+      <w:r>
+        <w:rPr>
+          <w:rFonts w:ascii="Consolas" w:eastAsia="Times New Roman" w:hAnsi="Consolas" w:cs="Times New Roman"/>
+          <w:color w:val="C586C0"/>
+          <w:sz w:val="21"/>
+          <w:szCs w:val="21"/>
+        </w:rPr>
+        <w:t>return</w:t>
+      </w:r>
+      <w:r>
+        <w:rPr>
+          <w:rFonts w:ascii="Consolas" w:eastAsia="Times New Roman" w:hAnsi="Consolas" w:cs="Times New Roman"/>
+          <w:color w:val="D4D4D4"/>
+          <w:sz w:val="21"/>
+          <w:szCs w:val="21"/>
+        </w:rPr>
+        <w:t xml:space="preserve"> </w:t>
+      </w:r>
+      <w:r>
+        <w:rPr>
+          <w:rFonts w:ascii="Consolas" w:eastAsia="Times New Roman" w:hAnsi="Consolas" w:cs="Times New Roman"/>
+          <w:color w:val="DCDCAA"/>
+          <w:sz w:val="21"/>
+          <w:szCs w:val="21"/>
+        </w:rPr>
+        <w:t>redirect</w:t>
+      </w:r>
+      <w:r>
+        <w:rPr>
+          <w:rFonts w:ascii="Consolas" w:eastAsia="Times New Roman" w:hAnsi="Consolas" w:cs="Times New Roman"/>
+          <w:color w:val="D4D4D4"/>
+          <w:sz w:val="21"/>
+          <w:szCs w:val="21"/>
+        </w:rPr>
+        <w:t>(</w:t>
+      </w:r>
+      <w:r>
+        <w:rPr>
+          <w:rFonts w:ascii="Consolas" w:eastAsia="Times New Roman" w:hAnsi="Consolas" w:cs="Times New Roman"/>
+          <w:color w:val="9CDCFE"/>
+          <w:sz w:val="21"/>
+          <w:szCs w:val="21"/>
+        </w:rPr>
+        <w:t>$domain</w:t>
+      </w:r>
+      <w:r>
+        <w:rPr>
+          <w:rFonts w:ascii="Consolas" w:eastAsia="Times New Roman" w:hAnsi="Consolas" w:cs="Times New Roman"/>
+          <w:color w:val="D4D4D4"/>
+          <w:sz w:val="21"/>
+          <w:szCs w:val="21"/>
+        </w:rPr>
+        <w:t>)-&gt;</w:t>
+      </w:r>
+      <w:proofErr w:type="gramStart"/>
+      <w:r>
+        <w:rPr>
+          <w:rFonts w:ascii="Consolas" w:eastAsia="Times New Roman" w:hAnsi="Consolas" w:cs="Times New Roman"/>
+          <w:color w:val="DCDCAA"/>
+          <w:sz w:val="21"/>
+          <w:szCs w:val="21"/>
+        </w:rPr>
+        <w:t>with</w:t>
+      </w:r>
+      <w:r>
+        <w:rPr>
+          <w:rFonts w:ascii="Consolas" w:eastAsia="Times New Roman" w:hAnsi="Consolas" w:cs="Times New Roman"/>
+          <w:color w:val="D4D4D4"/>
+          <w:sz w:val="21"/>
+          <w:szCs w:val="21"/>
+        </w:rPr>
+        <w:t>(</w:t>
+      </w:r>
+      <w:proofErr w:type="gramEnd"/>
+      <w:r>
+        <w:rPr>
+          <w:rFonts w:ascii="Consolas" w:eastAsia="Times New Roman" w:hAnsi="Consolas" w:cs="Times New Roman"/>
+          <w:color w:val="CE9178"/>
+          <w:sz w:val="21"/>
+          <w:szCs w:val="21"/>
+        </w:rPr>
+        <w:t>'error'</w:t>
+      </w:r>
+      <w:r>
+        <w:rPr>
+          <w:rFonts w:ascii="Consolas" w:eastAsia="Times New Roman" w:hAnsi="Consolas" w:cs="Times New Roman"/>
+          <w:color w:val="D4D4D4"/>
+          <w:sz w:val="21"/>
+          <w:szCs w:val="21"/>
+        </w:rPr>
+        <w:t xml:space="preserve">, </w:t>
+      </w:r>
+      <w:r>
+        <w:rPr>
+          <w:rFonts w:ascii="Consolas" w:eastAsia="Times New Roman" w:hAnsi="Consolas" w:cs="Times New Roman"/>
+          <w:color w:val="CE9178"/>
+          <w:sz w:val="21"/>
+          <w:szCs w:val="21"/>
+        </w:rPr>
+        <w:t>'Bạn không dùng được chức năng '</w:t>
+      </w:r>
+      <w:r>
+        <w:rPr>
+          <w:rFonts w:ascii="Consolas" w:eastAsia="Times New Roman" w:hAnsi="Consolas" w:cs="Times New Roman"/>
+          <w:color w:val="D4D4D4"/>
+          <w:sz w:val="21"/>
+          <w:szCs w:val="21"/>
+        </w:rPr>
+        <w:t>.</w:t>
+      </w:r>
+      <w:r>
+        <w:rPr>
+          <w:rFonts w:ascii="Consolas" w:eastAsia="Times New Roman" w:hAnsi="Consolas" w:cs="Times New Roman"/>
+          <w:color w:val="9CDCFE"/>
+          <w:sz w:val="21"/>
+          <w:szCs w:val="21"/>
+        </w:rPr>
+        <w:t>$permission</w:t>
+      </w:r>
+      <w:r>
+        <w:rPr>
+          <w:rFonts w:ascii="Consolas" w:eastAsia="Times New Roman" w:hAnsi="Consolas" w:cs="Times New Roman"/>
+          <w:color w:val="D4D4D4"/>
+          <w:sz w:val="21"/>
+          <w:szCs w:val="21"/>
+        </w:rPr>
+        <w:t>.</w:t>
+      </w:r>
+      <w:r>
+        <w:rPr>
+          <w:rFonts w:ascii="Consolas" w:eastAsia="Times New Roman" w:hAnsi="Consolas" w:cs="Times New Roman"/>
+          <w:color w:val="CE9178"/>
+          <w:sz w:val="21"/>
+          <w:szCs w:val="21"/>
+        </w:rPr>
+        <w:t>'!'</w:t>
+      </w:r>
+      <w:r>
+        <w:rPr>
+          <w:rFonts w:ascii="Consolas" w:eastAsia="Times New Roman" w:hAnsi="Consolas" w:cs="Times New Roman"/>
+          <w:color w:val="D4D4D4"/>
+          <w:sz w:val="21"/>
+          <w:szCs w:val="21"/>
+        </w:rPr>
+        <w:t>);</w:t>
+      </w:r>
+    </w:p>
+    <w:p>
+      <w:pPr>
+        <w:pStyle w:val="ListParagraph"/>
+        <w:numPr>
+          <w:ilvl w:val="1"/>
+          <w:numId w:val="4"/>
+        </w:numPr>
+        <w:jc w:val="both"/>
+        <w:rPr>
+          <w:rFonts w:ascii="Times New Roman" w:hAnsi="Times New Roman" w:cs="Times New Roman"/>
+          <w:sz w:val="34"/>
+          <w:szCs w:val="34"/>
+        </w:rPr>
+      </w:pPr>
+      <w:r>
+        <w:rPr>
+          <w:rFonts w:ascii="Times New Roman" w:hAnsi="Times New Roman" w:cs="Times New Roman"/>
+          <w:sz w:val="34"/>
+          <w:szCs w:val="34"/>
+        </w:rPr>
+        <w:t>Sau đó chúng ta qua bên controller sẽ</w:t>
+      </w:r>
+      <w:r>
+        <w:rPr>
+          <w:rFonts w:ascii="Times New Roman" w:hAnsi="Times New Roman" w:cs="Times New Roman"/>
+          <w:sz w:val="34"/>
+          <w:szCs w:val="34"/>
+        </w:rPr>
+        <w:t xml:space="preserve"> làm </w:t>
+      </w:r>
+      <w:r>
+        <w:rPr>
+          <w:rFonts w:ascii="Times New Roman" w:hAnsi="Times New Roman" w:cs="Times New Roman"/>
+          <w:sz w:val="34"/>
+          <w:szCs w:val="34"/>
+        </w:rPr>
+        <w:t xml:space="preserve">phân quyền bằng </w:t>
+      </w:r>
+      <w:r>
+        <w:rPr>
+          <w:rFonts w:ascii="Times New Roman" w:hAnsi="Times New Roman" w:cs="Times New Roman"/>
+          <w:sz w:val="34"/>
+          <w:szCs w:val="34"/>
+        </w:rPr>
+        <w:t>middleware</w:t>
+      </w:r>
+      <w:r>
+        <w:rPr>
+          <w:rFonts w:ascii="Times New Roman" w:hAnsi="Times New Roman" w:cs="Times New Roman"/>
+          <w:sz w:val="34"/>
+          <w:szCs w:val="34"/>
+        </w:rPr>
+        <w:t xml:space="preserve"> cho từng cá thể router</w:t>
+      </w:r>
+      <w:r>
+        <w:rPr>
+          <w:rFonts w:ascii="Times New Roman" w:hAnsi="Times New Roman" w:cs="Times New Roman"/>
+          <w:sz w:val="34"/>
+          <w:szCs w:val="34"/>
+        </w:rPr>
+        <w:t>.</w:t>
+      </w:r>
+    </w:p>
+    <w:p>
+      <w:pPr>
+        <w:pStyle w:val="ListParagraph"/>
+        <w:numPr>
+          <w:ilvl w:val="2"/>
+          <w:numId w:val="4"/>
+        </w:numPr>
+        <w:shd w:val="clear" w:color="auto" w:fill="1E1E1E"/>
+        <w:spacing w:after="0" w:line="285" w:lineRule="atLeast"/>
+        <w:rPr>
+          <w:rFonts w:ascii="Consolas" w:eastAsia="Times New Roman" w:hAnsi="Consolas" w:cs="Times New Roman"/>
+          <w:color w:val="D4D4D4"/>
+          <w:sz w:val="21"/>
+          <w:szCs w:val="21"/>
+        </w:rPr>
+      </w:pPr>
+      <w:r>
+        <w:rPr>
+          <w:rFonts w:ascii="Consolas" w:eastAsia="Times New Roman" w:hAnsi="Consolas" w:cs="Times New Roman"/>
+          <w:color w:val="D4D4D4"/>
+          <w:sz w:val="21"/>
+          <w:szCs w:val="21"/>
+        </w:rPr>
+        <w:t> </w:t>
+      </w:r>
+      <w:proofErr w:type="gramStart"/>
+      <w:r>
+        <w:rPr>
+          <w:rFonts w:ascii="Consolas" w:eastAsia="Times New Roman" w:hAnsi="Consolas" w:cs="Times New Roman"/>
+          <w:color w:val="4EC9B0"/>
+          <w:sz w:val="21"/>
+          <w:szCs w:val="21"/>
+        </w:rPr>
+        <w:t>Route</w:t>
+      </w:r>
+      <w:r>
+        <w:rPr>
+          <w:rFonts w:ascii="Consolas" w:eastAsia="Times New Roman" w:hAnsi="Consolas" w:cs="Times New Roman"/>
+          <w:color w:val="D4D4D4"/>
+          <w:sz w:val="21"/>
+          <w:szCs w:val="21"/>
+        </w:rPr>
+        <w:t>::</w:t>
+      </w:r>
+      <w:proofErr w:type="gramEnd"/>
+      <w:r>
+        <w:rPr>
+          <w:rFonts w:ascii="Consolas" w:eastAsia="Times New Roman" w:hAnsi="Consolas" w:cs="Times New Roman"/>
+          <w:color w:val="DCDCAA"/>
+          <w:sz w:val="21"/>
+          <w:szCs w:val="21"/>
+        </w:rPr>
+        <w:t>get</w:t>
+      </w:r>
+      <w:r>
+        <w:rPr>
+          <w:rFonts w:ascii="Consolas" w:eastAsia="Times New Roman" w:hAnsi="Consolas" w:cs="Times New Roman"/>
+          <w:color w:val="D4D4D4"/>
+          <w:sz w:val="21"/>
+          <w:szCs w:val="21"/>
+        </w:rPr>
+        <w:t>(</w:t>
+      </w:r>
+      <w:r>
+        <w:rPr>
+          <w:rFonts w:ascii="Consolas" w:eastAsia="Times New Roman" w:hAnsi="Consolas" w:cs="Times New Roman"/>
+          <w:color w:val="CE9178"/>
+          <w:sz w:val="21"/>
+          <w:szCs w:val="21"/>
+        </w:rPr>
+        <w:t>'/'</w:t>
+      </w:r>
+      <w:r>
+        <w:rPr>
+          <w:rFonts w:ascii="Consolas" w:eastAsia="Times New Roman" w:hAnsi="Consolas" w:cs="Times New Roman"/>
+          <w:color w:val="D4D4D4"/>
+          <w:sz w:val="21"/>
+          <w:szCs w:val="21"/>
+        </w:rPr>
+        <w:t>, [</w:t>
+      </w:r>
+      <w:r>
+        <w:rPr>
+          <w:rFonts w:ascii="Consolas" w:eastAsia="Times New Roman" w:hAnsi="Consolas" w:cs="Times New Roman"/>
+          <w:color w:val="4EC9B0"/>
+          <w:sz w:val="21"/>
+          <w:szCs w:val="21"/>
+        </w:rPr>
+        <w:t>UserController</w:t>
+      </w:r>
+      <w:r>
+        <w:rPr>
+          <w:rFonts w:ascii="Consolas" w:eastAsia="Times New Roman" w:hAnsi="Consolas" w:cs="Times New Roman"/>
+          <w:color w:val="D4D4D4"/>
+          <w:sz w:val="21"/>
+          <w:szCs w:val="21"/>
+        </w:rPr>
+        <w:t>::</w:t>
+      </w:r>
+      <w:r>
+        <w:rPr>
+          <w:rFonts w:ascii="Consolas" w:eastAsia="Times New Roman" w:hAnsi="Consolas" w:cs="Times New Roman"/>
+          <w:color w:val="569CD6"/>
+          <w:sz w:val="21"/>
+          <w:szCs w:val="21"/>
+        </w:rPr>
+        <w:t>class</w:t>
+      </w:r>
+      <w:r>
+        <w:rPr>
+          <w:rFonts w:ascii="Consolas" w:eastAsia="Times New Roman" w:hAnsi="Consolas" w:cs="Times New Roman"/>
+          <w:color w:val="D4D4D4"/>
+          <w:sz w:val="21"/>
+          <w:szCs w:val="21"/>
+        </w:rPr>
+        <w:t>,</w:t>
+      </w:r>
+      <w:r>
+        <w:rPr>
+          <w:rFonts w:ascii="Consolas" w:eastAsia="Times New Roman" w:hAnsi="Consolas" w:cs="Times New Roman"/>
+          <w:color w:val="CE9178"/>
+          <w:sz w:val="21"/>
+          <w:szCs w:val="21"/>
+        </w:rPr>
+        <w:t>'index'</w:t>
+      </w:r>
+      <w:r>
+        <w:rPr>
+          <w:rFonts w:ascii="Consolas" w:eastAsia="Times New Roman" w:hAnsi="Consolas" w:cs="Times New Roman"/>
+          <w:color w:val="D4D4D4"/>
+          <w:sz w:val="21"/>
+          <w:szCs w:val="21"/>
+        </w:rPr>
+        <w:t>])-&gt;</w:t>
+      </w:r>
+      <w:r>
+        <w:rPr>
+          <w:rFonts w:ascii="Consolas" w:eastAsia="Times New Roman" w:hAnsi="Consolas" w:cs="Times New Roman"/>
+          <w:color w:val="DCDCAA"/>
+          <w:sz w:val="21"/>
+          <w:szCs w:val="21"/>
+        </w:rPr>
+        <w:t>name</w:t>
+      </w:r>
+      <w:r>
+        <w:rPr>
+          <w:rFonts w:ascii="Consolas" w:eastAsia="Times New Roman" w:hAnsi="Consolas" w:cs="Times New Roman"/>
+          <w:color w:val="D4D4D4"/>
+          <w:sz w:val="21"/>
+          <w:szCs w:val="21"/>
+        </w:rPr>
+        <w:t>(</w:t>
+      </w:r>
+      <w:r>
+        <w:rPr>
+          <w:rFonts w:ascii="Consolas" w:eastAsia="Times New Roman" w:hAnsi="Consolas" w:cs="Times New Roman"/>
+          <w:color w:val="CE9178"/>
+          <w:sz w:val="21"/>
+          <w:szCs w:val="21"/>
+        </w:rPr>
+        <w:t>'admin.index.user'</w:t>
+      </w:r>
+      <w:r>
+        <w:rPr>
+          <w:rFonts w:ascii="Consolas" w:eastAsia="Times New Roman" w:hAnsi="Consolas" w:cs="Times New Roman"/>
+          <w:color w:val="D4D4D4"/>
+          <w:sz w:val="21"/>
+          <w:szCs w:val="21"/>
+        </w:rPr>
+        <w:t>)-&gt;</w:t>
+      </w:r>
+      <w:r>
+        <w:rPr>
+          <w:rFonts w:ascii="Consolas" w:eastAsia="Times New Roman" w:hAnsi="Consolas" w:cs="Times New Roman"/>
+          <w:color w:val="DCDCAA"/>
+          <w:sz w:val="21"/>
+          <w:szCs w:val="21"/>
+        </w:rPr>
+        <w:t>middleware</w:t>
+      </w:r>
+      <w:r>
+        <w:rPr>
+          <w:rFonts w:ascii="Consolas" w:eastAsia="Times New Roman" w:hAnsi="Consolas" w:cs="Times New Roman"/>
+          <w:color w:val="D4D4D4"/>
+          <w:sz w:val="21"/>
+          <w:szCs w:val="21"/>
+        </w:rPr>
+        <w:t>(</w:t>
+      </w:r>
+      <w:r>
+        <w:rPr>
+          <w:rFonts w:ascii="Consolas" w:eastAsia="Times New Roman" w:hAnsi="Consolas" w:cs="Times New Roman"/>
+          <w:color w:val="CE9178"/>
+          <w:sz w:val="21"/>
+          <w:szCs w:val="21"/>
+        </w:rPr>
+        <w:t>'checkPermission:user-list'</w:t>
+      </w:r>
+      <w:r>
+        <w:rPr>
+          <w:rFonts w:ascii="Consolas" w:eastAsia="Times New Roman" w:hAnsi="Consolas" w:cs="Times New Roman"/>
+          <w:color w:val="D4D4D4"/>
+          <w:sz w:val="21"/>
+          <w:szCs w:val="21"/>
+        </w:rPr>
+        <w:t>);</w:t>
       </w:r>
     </w:p>
     <w:p>
@@ -1753,6 +4115,28 @@
       </w:pPr>
       <w:bookmarkStart w:id="0" w:name="_GoBack"/>
       <w:bookmarkEnd w:id="0"/>
+    </w:p>
+    <w:p>
+      <w:pPr>
+        <w:jc w:val="both"/>
+        <w:rPr>
+          <w:rFonts w:ascii="Times New Roman" w:hAnsi="Times New Roman" w:cs="Times New Roman"/>
+          <w:sz w:val="34"/>
+          <w:szCs w:val="34"/>
+        </w:rPr>
+      </w:pPr>
+    </w:p>
+    <w:p>
+      <w:pPr>
+        <w:pStyle w:val="ListParagraph"/>
+        <w:ind w:left="1440"/>
+        <w:jc w:val="both"/>
+        <w:rPr>
+          <w:rFonts w:ascii="Times New Roman" w:hAnsi="Times New Roman" w:cs="Times New Roman"/>
+          <w:sz w:val="34"/>
+          <w:szCs w:val="34"/>
+        </w:rPr>
+      </w:pPr>
       <w:r>
         <w:rPr>
           <w:rFonts w:ascii="Times New Roman" w:hAnsi="Times New Roman" w:cs="Times New Roman"/>
@@ -1900,6 +4284,184 @@
     </w:lvl>
   </w:abstractNum>
   <w:abstractNum w:abstractNumId="1" w15:restartNumberingAfterBreak="0">
+    <w:nsid w:val="11D4184D"/>
+    <w:multiLevelType w:val="hybridMultilevel"/>
+    <w:tmpl w:val="B48AB302"/>
+    <w:lvl w:ilvl="0" w:tplc="0409000F">
+      <w:start w:val="1"/>
+      <w:numFmt w:val="decimal"/>
+      <w:lvlText w:val="%1."/>
+      <w:lvlJc w:val="left"/>
+      <w:pPr>
+        <w:ind w:left="720" w:hanging="360"/>
+      </w:pPr>
+      <w:rPr>
+        <w:rFonts w:hint="default"/>
+      </w:rPr>
+    </w:lvl>
+    <w:lvl w:ilvl="1" w:tplc="04090019" w:tentative="1">
+      <w:start w:val="1"/>
+      <w:numFmt w:val="lowerLetter"/>
+      <w:lvlText w:val="%2."/>
+      <w:lvlJc w:val="left"/>
+      <w:pPr>
+        <w:ind w:left="1440" w:hanging="360"/>
+      </w:pPr>
+    </w:lvl>
+    <w:lvl w:ilvl="2" w:tplc="0409001B" w:tentative="1">
+      <w:start w:val="1"/>
+      <w:numFmt w:val="lowerRoman"/>
+      <w:lvlText w:val="%3."/>
+      <w:lvlJc w:val="right"/>
+      <w:pPr>
+        <w:ind w:left="2160" w:hanging="180"/>
+      </w:pPr>
+    </w:lvl>
+    <w:lvl w:ilvl="3" w:tplc="0409000F" w:tentative="1">
+      <w:start w:val="1"/>
+      <w:numFmt w:val="decimal"/>
+      <w:lvlText w:val="%4."/>
+      <w:lvlJc w:val="left"/>
+      <w:pPr>
+        <w:ind w:left="2880" w:hanging="360"/>
+      </w:pPr>
+    </w:lvl>
+    <w:lvl w:ilvl="4" w:tplc="04090019" w:tentative="1">
+      <w:start w:val="1"/>
+      <w:numFmt w:val="lowerLetter"/>
+      <w:lvlText w:val="%5."/>
+      <w:lvlJc w:val="left"/>
+      <w:pPr>
+        <w:ind w:left="3600" w:hanging="360"/>
+      </w:pPr>
+    </w:lvl>
+    <w:lvl w:ilvl="5" w:tplc="0409001B" w:tentative="1">
+      <w:start w:val="1"/>
+      <w:numFmt w:val="lowerRoman"/>
+      <w:lvlText w:val="%6."/>
+      <w:lvlJc w:val="right"/>
+      <w:pPr>
+        <w:ind w:left="4320" w:hanging="180"/>
+      </w:pPr>
+    </w:lvl>
+    <w:lvl w:ilvl="6" w:tplc="0409000F" w:tentative="1">
+      <w:start w:val="1"/>
+      <w:numFmt w:val="decimal"/>
+      <w:lvlText w:val="%7."/>
+      <w:lvlJc w:val="left"/>
+      <w:pPr>
+        <w:ind w:left="5040" w:hanging="360"/>
+      </w:pPr>
+    </w:lvl>
+    <w:lvl w:ilvl="7" w:tplc="04090019" w:tentative="1">
+      <w:start w:val="1"/>
+      <w:numFmt w:val="lowerLetter"/>
+      <w:lvlText w:val="%8."/>
+      <w:lvlJc w:val="left"/>
+      <w:pPr>
+        <w:ind w:left="5760" w:hanging="360"/>
+      </w:pPr>
+    </w:lvl>
+    <w:lvl w:ilvl="8" w:tplc="0409001B" w:tentative="1">
+      <w:start w:val="1"/>
+      <w:numFmt w:val="lowerRoman"/>
+      <w:lvlText w:val="%9."/>
+      <w:lvlJc w:val="right"/>
+      <w:pPr>
+        <w:ind w:left="6480" w:hanging="180"/>
+      </w:pPr>
+    </w:lvl>
+  </w:abstractNum>
+  <w:abstractNum w:abstractNumId="2" w15:restartNumberingAfterBreak="0">
+    <w:nsid w:val="416B69D3"/>
+    <w:multiLevelType w:val="hybridMultilevel"/>
+    <w:tmpl w:val="ED684450"/>
+    <w:lvl w:ilvl="0" w:tplc="0409000F">
+      <w:start w:val="1"/>
+      <w:numFmt w:val="decimal"/>
+      <w:lvlText w:val="%1."/>
+      <w:lvlJc w:val="left"/>
+      <w:pPr>
+        <w:ind w:left="720" w:hanging="360"/>
+      </w:pPr>
+      <w:rPr>
+        <w:rFonts w:hint="default"/>
+      </w:rPr>
+    </w:lvl>
+    <w:lvl w:ilvl="1" w:tplc="04090019">
+      <w:start w:val="1"/>
+      <w:numFmt w:val="lowerLetter"/>
+      <w:lvlText w:val="%2."/>
+      <w:lvlJc w:val="left"/>
+      <w:pPr>
+        <w:ind w:left="1440" w:hanging="360"/>
+      </w:pPr>
+    </w:lvl>
+    <w:lvl w:ilvl="2" w:tplc="0409001B">
+      <w:start w:val="1"/>
+      <w:numFmt w:val="lowerRoman"/>
+      <w:lvlText w:val="%3."/>
+      <w:lvlJc w:val="right"/>
+      <w:pPr>
+        <w:ind w:left="2160" w:hanging="180"/>
+      </w:pPr>
+    </w:lvl>
+    <w:lvl w:ilvl="3" w:tplc="0409000F" w:tentative="1">
+      <w:start w:val="1"/>
+      <w:numFmt w:val="decimal"/>
+      <w:lvlText w:val="%4."/>
+      <w:lvlJc w:val="left"/>
+      <w:pPr>
+        <w:ind w:left="2880" w:hanging="360"/>
+      </w:pPr>
+    </w:lvl>
+    <w:lvl w:ilvl="4" w:tplc="04090019" w:tentative="1">
+      <w:start w:val="1"/>
+      <w:numFmt w:val="lowerLetter"/>
+      <w:lvlText w:val="%5."/>
+      <w:lvlJc w:val="left"/>
+      <w:pPr>
+        <w:ind w:left="3600" w:hanging="360"/>
+      </w:pPr>
+    </w:lvl>
+    <w:lvl w:ilvl="5" w:tplc="0409001B" w:tentative="1">
+      <w:start w:val="1"/>
+      <w:numFmt w:val="lowerRoman"/>
+      <w:lvlText w:val="%6."/>
+      <w:lvlJc w:val="right"/>
+      <w:pPr>
+        <w:ind w:left="4320" w:hanging="180"/>
+      </w:pPr>
+    </w:lvl>
+    <w:lvl w:ilvl="6" w:tplc="0409000F" w:tentative="1">
+      <w:start w:val="1"/>
+      <w:numFmt w:val="decimal"/>
+      <w:lvlText w:val="%7."/>
+      <w:lvlJc w:val="left"/>
+      <w:pPr>
+        <w:ind w:left="5040" w:hanging="360"/>
+      </w:pPr>
+    </w:lvl>
+    <w:lvl w:ilvl="7" w:tplc="04090019" w:tentative="1">
+      <w:start w:val="1"/>
+      <w:numFmt w:val="lowerLetter"/>
+      <w:lvlText w:val="%8."/>
+      <w:lvlJc w:val="left"/>
+      <w:pPr>
+        <w:ind w:left="5760" w:hanging="360"/>
+      </w:pPr>
+    </w:lvl>
+    <w:lvl w:ilvl="8" w:tplc="0409001B" w:tentative="1">
+      <w:start w:val="1"/>
+      <w:numFmt w:val="lowerRoman"/>
+      <w:lvlText w:val="%9."/>
+      <w:lvlJc w:val="right"/>
+      <w:pPr>
+        <w:ind w:left="6480" w:hanging="180"/>
+      </w:pPr>
+    </w:lvl>
+  </w:abstractNum>
+  <w:abstractNum w:abstractNumId="3" w15:restartNumberingAfterBreak="0">
     <w:nsid w:val="6D8856C8"/>
     <w:multiLevelType w:val="hybridMultilevel"/>
     <w:tmpl w:val="B5064D40"/>
@@ -2016,7 +4578,13 @@
     <w:abstractNumId w:val="0"/>
   </w:num>
   <w:num w:numId="2">
+    <w:abstractNumId w:val="3"/>
+  </w:num>
+  <w:num w:numId="3">
     <w:abstractNumId w:val="1"/>
+  </w:num>
+  <w:num w:numId="4">
+    <w:abstractNumId w:val="2"/>
   </w:num>
 </w:numbering>
 </file>

</xml_diff>